<commit_message>
Auto-archive: Daily PIB UPSC Brief 2026-10-06
</commit_message>
<xml_diff>
--- a/output/PIB_UPSC_Daily_2026-10-06.docx
+++ b/output/PIB_UPSC_Daily_2026-10-06.docx
@@ -53,7 +53,7 @@
                 <w:b/>
                 <w:sz w:val="20"/>
               </w:rPr>
-              <w:t>DAILY SUMMARY: Scraped 3 total PIB releases today. Found 0 high-yield articles aligned with the UPSC syllabus (None).</w:t>
+              <w:t>DAILY SUMMARY: Scraped 48 total PIB releases today. Found 16 high-yield articles aligned with the UPSC syllabus (GS-1: 2, GS-2: 7, GS-3: 7).</w:t>
             </w:r>
           </w:p>
         </w:tc>
@@ -63,6 +63,896 @@
       <w:pPr>
         <w:spacing w:after="160"/>
       </w:pPr>
+    </w:p>
+    <w:p>
+      <w:pPr>
+        <w:spacing w:before="320" w:after="80"/>
+      </w:pPr>
+      <w:r>
+        <w:rPr>
+          <w:rFonts w:ascii="Arial" w:hAnsi="Arial"/>
+          <w:b/>
+          <w:color w:val="2563EB"/>
+          <w:sz w:val="26"/>
+        </w:rPr>
+        <w:t>■ General Studies 1: Indian Heritage, Culture, History, Society &amp; World Geography</w:t>
+      </w:r>
+    </w:p>
+    <w:p>
+      <w:pPr>
+        <w:spacing w:before="80" w:after="40"/>
+        <w:ind w:left="288"/>
+      </w:pPr>
+      <w:r>
+        <w:rPr>
+          <w:b/>
+        </w:rPr>
+        <w:t xml:space="preserve">1. </w:t>
+      </w:r>
+      <w:r>
+        <w:rPr>
+          <w:rFonts w:ascii="Calibri" w:hAnsi="Calibri"/>
+          <w:b/>
+          <w:sz w:val="23"/>
+        </w:rPr>
+        <w:t>PM Mementos Brings Sikkim’s Cultural Heritage Closer to Citizens</w:t>
+        <w:br/>
+      </w:r>
+    </w:p>
+    <w:p>
+      <w:pPr>
+        <w:spacing w:after="40"/>
+        <w:ind w:left="576"/>
+      </w:pPr>
+      <w:r>
+        <w:rPr>
+          <w:i/>
+          <w:color w:val="64748B"/>
+          <w:sz w:val="19"/>
+        </w:rPr>
+        <w:t>Ministry: Ministry of Culture  |  Keywords: heritage</w:t>
+        <w:br/>
+      </w:r>
+      <w:r>
+        <w:rPr>
+          <w:b/>
+          <w:color w:val="1E40AF"/>
+          <w:sz w:val="20"/>
+        </w:rPr>
+        <w:t>UPSC Alignment: Aligned with General Studies 1 topics: heritage</w:t>
+        <w:br/>
+      </w:r>
+      <w:r>
+        <w:rPr>
+          <w:color w:val="0284C7"/>
+          <w:sz w:val="18"/>
+        </w:rPr>
+        <w:t>Official PIB Link: https://www.pib.gov.in/PressReleaseDetail.aspx?PRID=2319721</w:t>
+        <w:br/>
+      </w:r>
+    </w:p>
+    <w:p>
+      <w:pPr>
+        <w:spacing w:before="80" w:after="40"/>
+        <w:ind w:left="288"/>
+      </w:pPr>
+      <w:r>
+        <w:rPr>
+          <w:b/>
+        </w:rPr>
+        <w:t xml:space="preserve">2. </w:t>
+      </w:r>
+      <w:r>
+        <w:rPr>
+          <w:rFonts w:ascii="Calibri" w:hAnsi="Calibri"/>
+          <w:b/>
+          <w:sz w:val="23"/>
+        </w:rPr>
+        <w:t>National Conclave on Constitutional Rights and Legal Provisions for Tribal Communities</w:t>
+        <w:br/>
+      </w:r>
+    </w:p>
+    <w:p>
+      <w:pPr>
+        <w:spacing w:after="40"/>
+        <w:ind w:left="576"/>
+      </w:pPr>
+      <w:r>
+        <w:rPr>
+          <w:i/>
+          <w:color w:val="64748B"/>
+          <w:sz w:val="19"/>
+        </w:rPr>
+        <w:t>Ministry: Ministry of Tribal Affairs  |  Keywords: tribal</w:t>
+        <w:br/>
+      </w:r>
+      <w:r>
+        <w:rPr>
+          <w:b/>
+          <w:color w:val="1E40AF"/>
+          <w:sz w:val="20"/>
+        </w:rPr>
+        <w:t>UPSC Alignment: Aligned with General Studies 1 topics: tribal</w:t>
+        <w:br/>
+      </w:r>
+      <w:r>
+        <w:rPr>
+          <w:color w:val="0284C7"/>
+          <w:sz w:val="18"/>
+        </w:rPr>
+        <w:t>Official PIB Link: https://www.pib.gov.in/PressReleaseDetail.aspx?PRID=2319594</w:t>
+        <w:br/>
+      </w:r>
+    </w:p>
+    <w:p>
+      <w:pPr>
+        <w:spacing w:before="320" w:after="80"/>
+      </w:pPr>
+      <w:r>
+        <w:rPr>
+          <w:rFonts w:ascii="Arial" w:hAnsi="Arial"/>
+          <w:b/>
+          <w:color w:val="2563EB"/>
+          <w:sz w:val="26"/>
+        </w:rPr>
+        <w:t>■ General Studies 2: Governance, Constitution, Polity, Social Justice &amp; International Relations</w:t>
+      </w:r>
+    </w:p>
+    <w:p>
+      <w:pPr>
+        <w:spacing w:before="80" w:after="40"/>
+        <w:ind w:left="288"/>
+      </w:pPr>
+      <w:r>
+        <w:rPr>
+          <w:b/>
+        </w:rPr>
+        <w:t xml:space="preserve">1. </w:t>
+      </w:r>
+      <w:r>
+        <w:rPr>
+          <w:rFonts w:ascii="Calibri" w:hAnsi="Calibri"/>
+          <w:b/>
+          <w:sz w:val="23"/>
+        </w:rPr>
+        <w:t>STRONG DEMOCRACIES ARE BUILT ON DIALOGUE, DIVERSE VIEWS AND MEANINGFUL PUBLIC PARTICIPATION: LOK SABHA SPEAKER</w:t>
+        <w:br/>
+      </w:r>
+    </w:p>
+    <w:p>
+      <w:pPr>
+        <w:spacing w:after="40"/>
+        <w:ind w:left="576"/>
+      </w:pPr>
+      <w:r>
+        <w:rPr>
+          <w:i/>
+          <w:color w:val="64748B"/>
+          <w:sz w:val="19"/>
+        </w:rPr>
+        <w:t>Ministry: Lok Sabha Secretariat  |  Keywords: lok sabha</w:t>
+        <w:br/>
+      </w:r>
+      <w:r>
+        <w:rPr>
+          <w:b/>
+          <w:color w:val="1E40AF"/>
+          <w:sz w:val="20"/>
+        </w:rPr>
+        <w:t>UPSC Alignment: Aligned with General Studies 2 topics: lok sabha</w:t>
+        <w:br/>
+      </w:r>
+      <w:r>
+        <w:rPr>
+          <w:color w:val="0284C7"/>
+          <w:sz w:val="18"/>
+        </w:rPr>
+        <w:t>Official PIB Link: https://www.pib.gov.in/PressReleaseDetail.aspx?PRID=2319796</w:t>
+        <w:br/>
+      </w:r>
+    </w:p>
+    <w:p>
+      <w:pPr>
+        <w:spacing w:before="80" w:after="40"/>
+        <w:ind w:left="288"/>
+      </w:pPr>
+      <w:r>
+        <w:rPr>
+          <w:b/>
+        </w:rPr>
+        <w:t xml:space="preserve">2. </w:t>
+      </w:r>
+      <w:r>
+        <w:rPr>
+          <w:rFonts w:ascii="Calibri" w:hAnsi="Calibri"/>
+          <w:b/>
+          <w:sz w:val="23"/>
+        </w:rPr>
+        <w:t>Prime Minister shares an article on how India’s water-governance model is offering useful lessons for the wider Global South</w:t>
+        <w:br/>
+      </w:r>
+    </w:p>
+    <w:p>
+      <w:pPr>
+        <w:spacing w:after="40"/>
+        <w:ind w:left="576"/>
+      </w:pPr>
+      <w:r>
+        <w:rPr>
+          <w:i/>
+          <w:color w:val="64748B"/>
+          <w:sz w:val="19"/>
+        </w:rPr>
+        <w:t>Ministry: Prime Minister's Office  |  Keywords: governance</w:t>
+        <w:br/>
+      </w:r>
+      <w:r>
+        <w:rPr>
+          <w:b/>
+          <w:color w:val="1E40AF"/>
+          <w:sz w:val="20"/>
+        </w:rPr>
+        <w:t>UPSC Alignment: Aligned with General Studies 2 topics: governance</w:t>
+        <w:br/>
+      </w:r>
+      <w:r>
+        <w:rPr>
+          <w:color w:val="0284C7"/>
+          <w:sz w:val="18"/>
+        </w:rPr>
+        <w:t>Official PIB Link: https://www.pib.gov.in/PressReleaseDetail.aspx?PRID=2319539</w:t>
+        <w:br/>
+      </w:r>
+    </w:p>
+    <w:p>
+      <w:pPr>
+        <w:spacing w:before="80" w:after="40"/>
+        <w:ind w:left="288"/>
+      </w:pPr>
+      <w:r>
+        <w:rPr>
+          <w:b/>
+        </w:rPr>
+        <w:t xml:space="preserve">3. </w:t>
+      </w:r>
+      <w:r>
+        <w:rPr>
+          <w:rFonts w:ascii="Calibri" w:hAnsi="Calibri"/>
+          <w:b/>
+          <w:sz w:val="23"/>
+        </w:rPr>
+        <w:t>Cabinet approves Commitment of Rs.10,000 Crore towards establishment of the SME Growth Fund for direct equity investments in Small and Medium Enterprises to create future champions</w:t>
+        <w:br/>
+      </w:r>
+    </w:p>
+    <w:p>
+      <w:pPr>
+        <w:spacing w:after="40"/>
+        <w:ind w:left="576"/>
+      </w:pPr>
+      <w:r>
+        <w:rPr>
+          <w:i/>
+          <w:color w:val="64748B"/>
+          <w:sz w:val="19"/>
+        </w:rPr>
+        <w:t>Ministry: Cabinet  |  Keywords: cabinet approves</w:t>
+        <w:br/>
+      </w:r>
+      <w:r>
+        <w:rPr>
+          <w:b/>
+          <w:color w:val="1E40AF"/>
+          <w:sz w:val="20"/>
+        </w:rPr>
+        <w:t>UPSC Alignment: Aligned with General Studies 2 topics: cabinet approves</w:t>
+        <w:br/>
+      </w:r>
+      <w:r>
+        <w:rPr>
+          <w:color w:val="0284C7"/>
+          <w:sz w:val="18"/>
+        </w:rPr>
+        <w:t>Official PIB Link: https://www.pib.gov.in/PressReleaseDetail.aspx?PRID=2319532</w:t>
+        <w:br/>
+      </w:r>
+    </w:p>
+    <w:p>
+      <w:pPr>
+        <w:spacing w:before="80" w:after="40"/>
+        <w:ind w:left="288"/>
+      </w:pPr>
+      <w:r>
+        <w:rPr>
+          <w:b/>
+        </w:rPr>
+        <w:t xml:space="preserve">4. </w:t>
+      </w:r>
+      <w:r>
+        <w:rPr>
+          <w:rFonts w:ascii="Calibri" w:hAnsi="Calibri"/>
+          <w:b/>
+          <w:sz w:val="23"/>
+        </w:rPr>
+        <w:t>Cabinet approves setting up of Integrated Transport &amp; Logistics Authority</w:t>
+        <w:br/>
+      </w:r>
+    </w:p>
+    <w:p>
+      <w:pPr>
+        <w:spacing w:after="40"/>
+        <w:ind w:left="576"/>
+      </w:pPr>
+      <w:r>
+        <w:rPr>
+          <w:i/>
+          <w:color w:val="64748B"/>
+          <w:sz w:val="19"/>
+        </w:rPr>
+        <w:t>Ministry: Cabinet  |  Keywords: cabinet approves</w:t>
+        <w:br/>
+      </w:r>
+      <w:r>
+        <w:rPr>
+          <w:b/>
+          <w:color w:val="1E40AF"/>
+          <w:sz w:val="20"/>
+        </w:rPr>
+        <w:t>UPSC Alignment: Aligned with General Studies 2 topics: cabinet approves</w:t>
+        <w:br/>
+      </w:r>
+      <w:r>
+        <w:rPr>
+          <w:color w:val="0284C7"/>
+          <w:sz w:val="18"/>
+        </w:rPr>
+        <w:t>Official PIB Link: https://www.pib.gov.in/PressReleaseDetail.aspx?PRID=2319529</w:t>
+        <w:br/>
+      </w:r>
+    </w:p>
+    <w:p>
+      <w:pPr>
+        <w:spacing w:before="80" w:after="40"/>
+        <w:ind w:left="288"/>
+      </w:pPr>
+      <w:r>
+        <w:rPr>
+          <w:b/>
+        </w:rPr>
+        <w:t xml:space="preserve">5. </w:t>
+      </w:r>
+      <w:r>
+        <w:rPr>
+          <w:rFonts w:ascii="Calibri" w:hAnsi="Calibri"/>
+          <w:b/>
+          <w:sz w:val="23"/>
+        </w:rPr>
+        <w:t>PRESS RELEASE</w:t>
+        <w:br/>
+      </w:r>
+    </w:p>
+    <w:p>
+      <w:pPr>
+        <w:spacing w:after="40"/>
+        <w:ind w:left="576"/>
+      </w:pPr>
+      <w:r>
+        <w:rPr>
+          <w:i/>
+          <w:color w:val="64748B"/>
+          <w:sz w:val="19"/>
+        </w:rPr>
+        <w:t>Ministry: Rajya Sabha Secretariat  |  Keywords: rajya sabha</w:t>
+        <w:br/>
+      </w:r>
+      <w:r>
+        <w:rPr>
+          <w:b/>
+          <w:color w:val="1E40AF"/>
+          <w:sz w:val="20"/>
+        </w:rPr>
+        <w:t>UPSC Alignment: Aligned with General Studies 2 topics: rajya sabha</w:t>
+        <w:br/>
+      </w:r>
+      <w:r>
+        <w:rPr>
+          <w:color w:val="0284C7"/>
+          <w:sz w:val="18"/>
+        </w:rPr>
+        <w:t>Official PIB Link: https://www.pib.gov.in/PressReleaseDetail.aspx?PRID=2319486</w:t>
+        <w:br/>
+      </w:r>
+    </w:p>
+    <w:p>
+      <w:pPr>
+        <w:spacing w:before="80" w:after="40"/>
+        <w:ind w:left="288"/>
+      </w:pPr>
+      <w:r>
+        <w:rPr>
+          <w:b/>
+        </w:rPr>
+        <w:t xml:space="preserve">6. </w:t>
+      </w:r>
+      <w:r>
+        <w:rPr>
+          <w:rFonts w:ascii="Calibri" w:hAnsi="Calibri"/>
+          <w:b/>
+          <w:sz w:val="23"/>
+        </w:rPr>
+        <w:t>Cabinet approves setting up of Integrated Transport &amp; Logistics Authority</w:t>
+        <w:br/>
+      </w:r>
+    </w:p>
+    <w:p>
+      <w:pPr>
+        <w:spacing w:after="40"/>
+        <w:ind w:left="576"/>
+      </w:pPr>
+      <w:r>
+        <w:rPr>
+          <w:i/>
+          <w:color w:val="64748B"/>
+          <w:sz w:val="19"/>
+        </w:rPr>
+        <w:t>Ministry: Ministry of Commerce &amp; Industry  |  Keywords: cabinet approves</w:t>
+        <w:br/>
+      </w:r>
+      <w:r>
+        <w:rPr>
+          <w:b/>
+          <w:color w:val="1E40AF"/>
+          <w:sz w:val="20"/>
+        </w:rPr>
+        <w:t>UPSC Alignment: Aligned with General Studies 2 topics: cabinet approves</w:t>
+        <w:br/>
+      </w:r>
+      <w:r>
+        <w:rPr>
+          <w:color w:val="0284C7"/>
+          <w:sz w:val="18"/>
+        </w:rPr>
+        <w:t>Official PIB Link: https://www.pib.gov.in/PressReleaseDetail.aspx?PRID=2319531</w:t>
+        <w:br/>
+      </w:r>
+    </w:p>
+    <w:p>
+      <w:pPr>
+        <w:spacing w:before="80" w:after="40"/>
+        <w:ind w:left="288"/>
+      </w:pPr>
+      <w:r>
+        <w:rPr>
+          <w:b/>
+        </w:rPr>
+        <w:t xml:space="preserve">7. </w:t>
+      </w:r>
+      <w:r>
+        <w:rPr>
+          <w:rFonts w:ascii="Calibri" w:hAnsi="Calibri"/>
+          <w:b/>
+          <w:sz w:val="23"/>
+        </w:rPr>
+        <w:t>Cabinet approves Commitment of Rs.10,000 Crore towards establishment of the SME Growth Fund for direct equity investments in Small and Medium Enterprises to create future champions</w:t>
+        <w:br/>
+      </w:r>
+    </w:p>
+    <w:p>
+      <w:pPr>
+        <w:spacing w:after="40"/>
+        <w:ind w:left="576"/>
+      </w:pPr>
+      <w:r>
+        <w:rPr>
+          <w:i/>
+          <w:color w:val="64748B"/>
+          <w:sz w:val="19"/>
+        </w:rPr>
+        <w:t>Ministry: Ministry of Finance  |  Keywords: cabinet approves</w:t>
+        <w:br/>
+      </w:r>
+      <w:r>
+        <w:rPr>
+          <w:b/>
+          <w:color w:val="1E40AF"/>
+          <w:sz w:val="20"/>
+        </w:rPr>
+        <w:t>UPSC Alignment: Aligned with General Studies 2 topics: cabinet approves</w:t>
+        <w:br/>
+      </w:r>
+      <w:r>
+        <w:rPr>
+          <w:color w:val="0284C7"/>
+          <w:sz w:val="18"/>
+        </w:rPr>
+        <w:t>Official PIB Link: https://www.pib.gov.in/PressReleaseDetail.aspx?PRID=2319534</w:t>
+        <w:br/>
+      </w:r>
+    </w:p>
+    <w:p>
+      <w:pPr>
+        <w:spacing w:before="320" w:after="80"/>
+      </w:pPr>
+      <w:r>
+        <w:rPr>
+          <w:rFonts w:ascii="Arial" w:hAnsi="Arial"/>
+          <w:b/>
+          <w:color w:val="2563EB"/>
+          <w:sz w:val="26"/>
+        </w:rPr>
+        <w:t>■ General Studies 3: Economy, Agriculture, Science &amp; Tech, Environment &amp; Internal Security</w:t>
+      </w:r>
+    </w:p>
+    <w:p>
+      <w:pPr>
+        <w:spacing w:before="80" w:after="40"/>
+        <w:ind w:left="288"/>
+      </w:pPr>
+      <w:r>
+        <w:rPr>
+          <w:b/>
+        </w:rPr>
+        <w:t xml:space="preserve">1. </w:t>
+      </w:r>
+      <w:r>
+        <w:rPr>
+          <w:rFonts w:ascii="Calibri" w:hAnsi="Calibri"/>
+          <w:b/>
+          <w:sz w:val="23"/>
+        </w:rPr>
+        <w:t>DRDO Conducts Maiden Live Jump of Advanced High-Altitude Parachute</w:t>
+        <w:br/>
+      </w:r>
+    </w:p>
+    <w:p>
+      <w:pPr>
+        <w:spacing w:after="40"/>
+        <w:ind w:left="576"/>
+      </w:pPr>
+      <w:r>
+        <w:rPr>
+          <w:i/>
+          <w:color w:val="64748B"/>
+          <w:sz w:val="19"/>
+        </w:rPr>
+        <w:t>Ministry: Ministry of Defence  |  Keywords: drdo</w:t>
+        <w:br/>
+      </w:r>
+      <w:r>
+        <w:rPr>
+          <w:b/>
+          <w:color w:val="1E40AF"/>
+          <w:sz w:val="20"/>
+        </w:rPr>
+        <w:t>UPSC Alignment: Aligned with General Studies 3 topics: drdo</w:t>
+        <w:br/>
+      </w:r>
+      <w:r>
+        <w:rPr>
+          <w:color w:val="0284C7"/>
+          <w:sz w:val="18"/>
+        </w:rPr>
+        <w:t>Official PIB Link: https://www.pib.gov.in/PressReleaseDetail.aspx?PRID=2319589</w:t>
+        <w:br/>
+      </w:r>
+    </w:p>
+    <w:p>
+      <w:pPr>
+        <w:spacing w:before="80" w:after="40"/>
+        <w:ind w:left="288"/>
+      </w:pPr>
+      <w:r>
+        <w:rPr>
+          <w:b/>
+        </w:rPr>
+        <w:t xml:space="preserve">2. </w:t>
+      </w:r>
+      <w:r>
+        <w:rPr>
+          <w:rFonts w:ascii="Calibri" w:hAnsi="Calibri"/>
+          <w:b/>
+          <w:sz w:val="23"/>
+        </w:rPr>
+        <w:t>DRDO Conducts Flight Trial of High-Altitude Platform</w:t>
+        <w:br/>
+      </w:r>
+    </w:p>
+    <w:p>
+      <w:pPr>
+        <w:spacing w:after="40"/>
+        <w:ind w:left="576"/>
+      </w:pPr>
+      <w:r>
+        <w:rPr>
+          <w:i/>
+          <w:color w:val="64748B"/>
+          <w:sz w:val="19"/>
+        </w:rPr>
+        <w:t>Ministry: Ministry of Defence  |  Keywords: drdo</w:t>
+        <w:br/>
+      </w:r>
+      <w:r>
+        <w:rPr>
+          <w:b/>
+          <w:color w:val="1E40AF"/>
+          <w:sz w:val="20"/>
+        </w:rPr>
+        <w:t>UPSC Alignment: Aligned with General Studies 3 topics: drdo</w:t>
+        <w:br/>
+      </w:r>
+      <w:r>
+        <w:rPr>
+          <w:color w:val="0284C7"/>
+          <w:sz w:val="18"/>
+        </w:rPr>
+        <w:t>Official PIB Link: https://www.pib.gov.in/PressReleaseDetail.aspx?PRID=2319551</w:t>
+        <w:br/>
+      </w:r>
+    </w:p>
+    <w:p>
+      <w:pPr>
+        <w:spacing w:before="80" w:after="40"/>
+        <w:ind w:left="288"/>
+      </w:pPr>
+      <w:r>
+        <w:rPr>
+          <w:b/>
+        </w:rPr>
+        <w:t xml:space="preserve">3. </w:t>
+      </w:r>
+      <w:r>
+        <w:rPr>
+          <w:rFonts w:ascii="Calibri" w:hAnsi="Calibri"/>
+          <w:b/>
+          <w:sz w:val="23"/>
+        </w:rPr>
+        <w:t>Raksha Mantri launches first indigenous Fleet Support Ship ‘ Surya’ at Hindustan Shipyard Ltd in Visakhapatnam</w:t>
+        <w:br/>
+      </w:r>
+    </w:p>
+    <w:p>
+      <w:pPr>
+        <w:spacing w:after="40"/>
+        <w:ind w:left="576"/>
+      </w:pPr>
+      <w:r>
+        <w:rPr>
+          <w:i/>
+          <w:color w:val="64748B"/>
+          <w:sz w:val="19"/>
+        </w:rPr>
+        <w:t>Ministry: Ministry of Defence  |  Keywords: Internal &amp; External Security</w:t>
+        <w:br/>
+      </w:r>
+      <w:r>
+        <w:rPr>
+          <w:b/>
+          <w:color w:val="1E40AF"/>
+          <w:sz w:val="20"/>
+        </w:rPr>
+        <w:t>UPSC Alignment: Strategic policy update from nodal ministry (Ministry of Defence): Internal &amp; External Security / Defence Capabilities</w:t>
+        <w:br/>
+      </w:r>
+      <w:r>
+        <w:rPr>
+          <w:color w:val="0284C7"/>
+          <w:sz w:val="18"/>
+        </w:rPr>
+        <w:t>Official PIB Link: https://www.pib.gov.in/PressReleaseDetail.aspx?PRID=2319481</w:t>
+        <w:br/>
+      </w:r>
+    </w:p>
+    <w:p>
+      <w:pPr>
+        <w:spacing w:before="80" w:after="40"/>
+        <w:ind w:left="288"/>
+      </w:pPr>
+      <w:r>
+        <w:rPr>
+          <w:b/>
+        </w:rPr>
+        <w:t xml:space="preserve">4. </w:t>
+      </w:r>
+      <w:r>
+        <w:rPr>
+          <w:rFonts w:ascii="Calibri" w:hAnsi="Calibri"/>
+          <w:b/>
+          <w:sz w:val="23"/>
+        </w:rPr>
+        <w:t>CAQM mandates Installation of PTZ Cameras at Industries to ensure Comprehensive Real-time Monitoring of Fuel Use and Compliance in NCR</w:t>
+        <w:br/>
+      </w:r>
+    </w:p>
+    <w:p>
+      <w:pPr>
+        <w:spacing w:after="40"/>
+        <w:ind w:left="576"/>
+      </w:pPr>
+      <w:r>
+        <w:rPr>
+          <w:i/>
+          <w:color w:val="64748B"/>
+          <w:sz w:val="19"/>
+        </w:rPr>
+        <w:t>Ministry: Ministry of Environment, Forest and Climate Change  |  Keywords: climate change, caqm</w:t>
+        <w:br/>
+      </w:r>
+      <w:r>
+        <w:rPr>
+          <w:b/>
+          <w:color w:val="1E40AF"/>
+          <w:sz w:val="20"/>
+        </w:rPr>
+        <w:t>UPSC Alignment: Aligned with General Studies 3 topics: climate change, caqm</w:t>
+        <w:br/>
+      </w:r>
+      <w:r>
+        <w:rPr>
+          <w:color w:val="0284C7"/>
+          <w:sz w:val="18"/>
+        </w:rPr>
+        <w:t>Official PIB Link: https://www.pib.gov.in/PressReleaseDetail.aspx?PRID=2319694</w:t>
+        <w:br/>
+      </w:r>
+    </w:p>
+    <w:p>
+      <w:pPr>
+        <w:spacing w:before="80" w:after="40"/>
+        <w:ind w:left="288"/>
+      </w:pPr>
+      <w:r>
+        <w:rPr>
+          <w:b/>
+        </w:rPr>
+        <w:t xml:space="preserve">5. </w:t>
+      </w:r>
+      <w:r>
+        <w:rPr>
+          <w:rFonts w:ascii="Calibri" w:hAnsi="Calibri"/>
+          <w:b/>
+          <w:sz w:val="23"/>
+        </w:rPr>
+        <w:t>India calls for equal attention to Adaptation, Mitigation and Means of Implementation at Pre-COP31</w:t>
+        <w:br/>
+      </w:r>
+    </w:p>
+    <w:p>
+      <w:pPr>
+        <w:spacing w:after="40"/>
+        <w:ind w:left="576"/>
+      </w:pPr>
+      <w:r>
+        <w:rPr>
+          <w:i/>
+          <w:color w:val="64748B"/>
+          <w:sz w:val="19"/>
+        </w:rPr>
+        <w:t>Ministry: Ministry of Environment, Forest and Climate Change  |  Keywords: climate change</w:t>
+        <w:br/>
+      </w:r>
+      <w:r>
+        <w:rPr>
+          <w:b/>
+          <w:color w:val="1E40AF"/>
+          <w:sz w:val="20"/>
+        </w:rPr>
+        <w:t>UPSC Alignment: Aligned with General Studies 3 topics: climate change</w:t>
+        <w:br/>
+      </w:r>
+      <w:r>
+        <w:rPr>
+          <w:color w:val="0284C7"/>
+          <w:sz w:val="18"/>
+        </w:rPr>
+        <w:t>Official PIB Link: https://www.pib.gov.in/PressReleaseDetail.aspx?PRID=2319611</w:t>
+        <w:br/>
+      </w:r>
+    </w:p>
+    <w:p>
+      <w:pPr>
+        <w:spacing w:before="80" w:after="40"/>
+        <w:ind w:left="288"/>
+      </w:pPr>
+      <w:r>
+        <w:rPr>
+          <w:b/>
+        </w:rPr>
+        <w:t xml:space="preserve">6. </w:t>
+      </w:r>
+      <w:r>
+        <w:rPr>
+          <w:rFonts w:ascii="Calibri" w:hAnsi="Calibri"/>
+          <w:b/>
+          <w:sz w:val="23"/>
+        </w:rPr>
+        <w:t>Secretary, DFS, Shri Sanjay Lohiya chairs review meeting on progress of Financial Inclusion Schemes with senior executives of Public Sector and Private Sector Banks</w:t>
+        <w:br/>
+      </w:r>
+    </w:p>
+    <w:p>
+      <w:pPr>
+        <w:spacing w:after="40"/>
+        <w:ind w:left="576"/>
+      </w:pPr>
+      <w:r>
+        <w:rPr>
+          <w:i/>
+          <w:color w:val="64748B"/>
+          <w:sz w:val="19"/>
+        </w:rPr>
+        <w:t>Ministry: Ministry of Finance  |  Keywords: Economic Governance &amp; Fiscal Policy</w:t>
+        <w:br/>
+      </w:r>
+      <w:r>
+        <w:rPr>
+          <w:b/>
+          <w:color w:val="1E40AF"/>
+          <w:sz w:val="20"/>
+        </w:rPr>
+        <w:t>UPSC Alignment: Strategic policy update from nodal ministry (Ministry of Finance): Economic Governance &amp; Fiscal Policy</w:t>
+        <w:br/>
+      </w:r>
+      <w:r>
+        <w:rPr>
+          <w:color w:val="0284C7"/>
+          <w:sz w:val="18"/>
+        </w:rPr>
+        <w:t>Official PIB Link: https://www.pib.gov.in/PressReleaseDetail.aspx?PRID=2319696</w:t>
+        <w:br/>
+      </w:r>
+    </w:p>
+    <w:p>
+      <w:pPr>
+        <w:spacing w:before="80" w:after="40"/>
+        <w:ind w:left="288"/>
+      </w:pPr>
+      <w:r>
+        <w:rPr>
+          <w:b/>
+        </w:rPr>
+        <w:t xml:space="preserve">7. </w:t>
+      </w:r>
+      <w:r>
+        <w:rPr>
+          <w:rFonts w:ascii="Calibri" w:hAnsi="Calibri"/>
+          <w:b/>
+          <w:sz w:val="23"/>
+        </w:rPr>
+        <w:t>Chintan Shivir 2026 Concludes with Focus on Collaborative Knowledge Sharing for Quality Road Infrastructure</w:t>
+        <w:br/>
+      </w:r>
+    </w:p>
+    <w:p>
+      <w:pPr>
+        <w:spacing w:after="40"/>
+        <w:ind w:left="576"/>
+      </w:pPr>
+      <w:r>
+        <w:rPr>
+          <w:i/>
+          <w:color w:val="64748B"/>
+          <w:sz w:val="19"/>
+        </w:rPr>
+        <w:t>Ministry: Ministry of Road Transport &amp; Highways  |  Keywords: infrastructure</w:t>
+        <w:br/>
+      </w:r>
+      <w:r>
+        <w:rPr>
+          <w:b/>
+          <w:color w:val="1E40AF"/>
+          <w:sz w:val="20"/>
+        </w:rPr>
+        <w:t>UPSC Alignment: Aligned with General Studies 3 topics: infrastructure</w:t>
+        <w:br/>
+      </w:r>
+      <w:r>
+        <w:rPr>
+          <w:color w:val="0284C7"/>
+          <w:sz w:val="18"/>
+        </w:rPr>
+        <w:t>Official PIB Link: https://www.pib.gov.in/PressReleaseDetail.aspx?PRID=2319749</w:t>
+        <w:br/>
+      </w:r>
     </w:p>
     <w:sectPr>
       <w:pgSz w:w="12240" w:h="15840"/>

</xml_diff>

<commit_message>
Fix PIB links: generate native OpenXML clickable hyperlinks in Word and Excel
</commit_message>
<xml_diff>
--- a/output/PIB_UPSC_Daily_2026-10-06.docx
+++ b/output/PIB_UPSC_Daily_2026-10-06.docx
@@ -53,7 +53,7 @@
                 <w:b/>
                 <w:sz w:val="20"/>
               </w:rPr>
-              <w:t>DAILY SUMMARY: Scraped 50 total PIB releases today. Found 16 high-yield articles aligned with the UPSC syllabus (GS-1: 2, GS-2: 7, GS-3: 7).</w:t>
+              <w:t>DAILY SUMMARY: Scraped 56 total PIB releases today. Found 17 high-yield articles aligned with the UPSC syllabus (GS-1: 2, GS-2: 8, GS-3: 7).</w:t>
             </w:r>
           </w:p>
         </w:tc>
@@ -124,10 +124,23 @@
       </w:r>
       <w:r>
         <w:rPr>
-          <w:color w:val="0284C7"/>
+          <w:b/>
+          <w:color w:val="475569"/>
           <w:sz w:val="18"/>
         </w:rPr>
-        <w:t>Official PIB Link: https://www.pib.gov.in/PressReleaseDetail.aspx?PRID=2319721</w:t>
+        <w:t xml:space="preserve">Official PIB Link: </w:t>
+      </w:r>
+      <w:hyperlink r:id="rId9">
+        <w:r>
+          <w:rPr>
+            <w:color w:val="0284C7"/>
+            <w:u w:val="single"/>
+            <w:sz w:val="18"/>
+          </w:rPr>
+          <w:t>https://www.pib.gov.in/PressReleaseDetail.aspx?PRID=2319721</w:t>
+        </w:r>
+      </w:hyperlink>
+      <w:r>
         <w:br/>
       </w:r>
     </w:p>
@@ -177,10 +190,23 @@
       </w:r>
       <w:r>
         <w:rPr>
-          <w:color w:val="0284C7"/>
+          <w:b/>
+          <w:color w:val="475569"/>
           <w:sz w:val="18"/>
         </w:rPr>
-        <w:t>Official PIB Link: https://www.pib.gov.in/PressReleaseDetail.aspx?PRID=2319594</w:t>
+        <w:t xml:space="preserve">Official PIB Link: </w:t>
+      </w:r>
+      <w:hyperlink r:id="rId10">
+        <w:r>
+          <w:rPr>
+            <w:color w:val="0284C7"/>
+            <w:u w:val="single"/>
+            <w:sz w:val="18"/>
+          </w:rPr>
+          <w:t>https://www.pib.gov.in/PressReleaseDetail.aspx?PRID=2319594</w:t>
+        </w:r>
+      </w:hyperlink>
+      <w:r>
         <w:br/>
       </w:r>
     </w:p>
@@ -215,7 +241,7 @@
           <w:b/>
           <w:sz w:val="23"/>
         </w:rPr>
-        <w:t>Prime Minister shares an article on how India’s water-governance model is offering useful lessons for the wider Global South</w:t>
+        <w:t>STRONG DEMOCRACIES ARE BUILT ON DIALOGUE, DIVERSE VIEWS AND MEANINGFUL PUBLIC PARTICIPATION: LOK SABHA SPEAKER</w:t>
         <w:br/>
       </w:r>
     </w:p>
@@ -230,7 +256,7 @@
           <w:color w:val="64748B"/>
           <w:sz w:val="19"/>
         </w:rPr>
-        <w:t>Ministry: Prime Minister's Office  |  Keywords: governance</w:t>
+        <w:t>Ministry: Lok Sabha Secretariat  |  Keywords: lok sabha</w:t>
         <w:br/>
       </w:r>
       <w:r>
@@ -239,15 +265,28 @@
           <w:color w:val="1E40AF"/>
           <w:sz w:val="20"/>
         </w:rPr>
-        <w:t>UPSC Alignment: Aligned with General Studies 2 topics: governance</w:t>
+        <w:t>UPSC Alignment: Aligned with General Studies 2 topics: lok sabha</w:t>
         <w:br/>
       </w:r>
       <w:r>
         <w:rPr>
-          <w:color w:val="0284C7"/>
+          <w:b/>
+          <w:color w:val="475569"/>
           <w:sz w:val="18"/>
         </w:rPr>
-        <w:t>Official PIB Link: https://www.pib.gov.in/PressReleaseDetail.aspx?PRID=2319539</w:t>
+        <w:t xml:space="preserve">Official PIB Link: </w:t>
+      </w:r>
+      <w:hyperlink r:id="rId11">
+        <w:r>
+          <w:rPr>
+            <w:color w:val="0284C7"/>
+            <w:u w:val="single"/>
+            <w:sz w:val="18"/>
+          </w:rPr>
+          <w:t>https://www.pib.gov.in/PressReleaseDetail.aspx?PRID=2319828</w:t>
+        </w:r>
+      </w:hyperlink>
+      <w:r>
         <w:br/>
       </w:r>
     </w:p>
@@ -297,10 +336,23 @@
       </w:r>
       <w:r>
         <w:rPr>
-          <w:color w:val="0284C7"/>
+          <w:b/>
+          <w:color w:val="475569"/>
           <w:sz w:val="18"/>
         </w:rPr>
-        <w:t>Official PIB Link: https://www.pib.gov.in/PressReleaseDetail.aspx?PRID=2319796</w:t>
+        <w:t xml:space="preserve">Official PIB Link: </w:t>
+      </w:r>
+      <w:hyperlink r:id="rId12">
+        <w:r>
+          <w:rPr>
+            <w:color w:val="0284C7"/>
+            <w:u w:val="single"/>
+            <w:sz w:val="18"/>
+          </w:rPr>
+          <w:t>https://www.pib.gov.in/PressReleaseDetail.aspx?PRID=2319796</w:t>
+        </w:r>
+      </w:hyperlink>
+      <w:r>
         <w:br/>
       </w:r>
     </w:p>
@@ -314,6 +366,72 @@
           <w:b/>
         </w:rPr>
         <w:t xml:space="preserve">3. </w:t>
+      </w:r>
+      <w:r>
+        <w:rPr>
+          <w:rFonts w:ascii="Calibri" w:hAnsi="Calibri"/>
+          <w:b/>
+          <w:sz w:val="23"/>
+        </w:rPr>
+        <w:t>Prime Minister shares an article on how India’s water-governance model is offering useful lessons for the wider Global South</w:t>
+        <w:br/>
+      </w:r>
+    </w:p>
+    <w:p>
+      <w:pPr>
+        <w:spacing w:after="40"/>
+        <w:ind w:left="576"/>
+      </w:pPr>
+      <w:r>
+        <w:rPr>
+          <w:i/>
+          <w:color w:val="64748B"/>
+          <w:sz w:val="19"/>
+        </w:rPr>
+        <w:t>Ministry: Prime Minister's Office  |  Keywords: governance</w:t>
+        <w:br/>
+      </w:r>
+      <w:r>
+        <w:rPr>
+          <w:b/>
+          <w:color w:val="1E40AF"/>
+          <w:sz w:val="20"/>
+        </w:rPr>
+        <w:t>UPSC Alignment: Aligned with General Studies 2 topics: governance</w:t>
+        <w:br/>
+      </w:r>
+      <w:r>
+        <w:rPr>
+          <w:b/>
+          <w:color w:val="475569"/>
+          <w:sz w:val="18"/>
+        </w:rPr>
+        <w:t xml:space="preserve">Official PIB Link: </w:t>
+      </w:r>
+      <w:hyperlink r:id="rId13">
+        <w:r>
+          <w:rPr>
+            <w:color w:val="0284C7"/>
+            <w:u w:val="single"/>
+            <w:sz w:val="18"/>
+          </w:rPr>
+          <w:t>https://www.pib.gov.in/PressReleaseDetail.aspx?PRID=2319539</w:t>
+        </w:r>
+      </w:hyperlink>
+      <w:r>
+        <w:br/>
+      </w:r>
+    </w:p>
+    <w:p>
+      <w:pPr>
+        <w:spacing w:before="80" w:after="40"/>
+        <w:ind w:left="288"/>
+      </w:pPr>
+      <w:r>
+        <w:rPr>
+          <w:b/>
+        </w:rPr>
+        <w:t xml:space="preserve">4. </w:t>
       </w:r>
       <w:r>
         <w:rPr>
@@ -350,10 +468,23 @@
       </w:r>
       <w:r>
         <w:rPr>
-          <w:color w:val="0284C7"/>
+          <w:b/>
+          <w:color w:val="475569"/>
           <w:sz w:val="18"/>
         </w:rPr>
-        <w:t>Official PIB Link: https://www.pib.gov.in/PressReleaseDetail.aspx?PRID=2319532</w:t>
+        <w:t xml:space="preserve">Official PIB Link: </w:t>
+      </w:r>
+      <w:hyperlink r:id="rId14">
+        <w:r>
+          <w:rPr>
+            <w:color w:val="0284C7"/>
+            <w:u w:val="single"/>
+            <w:sz w:val="18"/>
+          </w:rPr>
+          <w:t>https://www.pib.gov.in/PressReleaseDetail.aspx?PRID=2319532</w:t>
+        </w:r>
+      </w:hyperlink>
+      <w:r>
         <w:br/>
       </w:r>
     </w:p>
@@ -366,7 +497,7 @@
         <w:rPr>
           <w:b/>
         </w:rPr>
-        <w:t xml:space="preserve">4. </w:t>
+        <w:t xml:space="preserve">5. </w:t>
       </w:r>
       <w:r>
         <w:rPr>
@@ -403,10 +534,23 @@
       </w:r>
       <w:r>
         <w:rPr>
-          <w:color w:val="0284C7"/>
+          <w:b/>
+          <w:color w:val="475569"/>
           <w:sz w:val="18"/>
         </w:rPr>
-        <w:t>Official PIB Link: https://www.pib.gov.in/PressReleaseDetail.aspx?PRID=2319529</w:t>
+        <w:t xml:space="preserve">Official PIB Link: </w:t>
+      </w:r>
+      <w:hyperlink r:id="rId15">
+        <w:r>
+          <w:rPr>
+            <w:color w:val="0284C7"/>
+            <w:u w:val="single"/>
+            <w:sz w:val="18"/>
+          </w:rPr>
+          <w:t>https://www.pib.gov.in/PressReleaseDetail.aspx?PRID=2319529</w:t>
+        </w:r>
+      </w:hyperlink>
+      <w:r>
         <w:br/>
       </w:r>
     </w:p>
@@ -419,7 +563,7 @@
         <w:rPr>
           <w:b/>
         </w:rPr>
-        <w:t xml:space="preserve">5. </w:t>
+        <w:t xml:space="preserve">6. </w:t>
       </w:r>
       <w:r>
         <w:rPr>
@@ -456,10 +600,23 @@
       </w:r>
       <w:r>
         <w:rPr>
-          <w:color w:val="0284C7"/>
+          <w:b/>
+          <w:color w:val="475569"/>
           <w:sz w:val="18"/>
         </w:rPr>
-        <w:t>Official PIB Link: https://www.pib.gov.in/PressReleaseDetail.aspx?PRID=2319486</w:t>
+        <w:t xml:space="preserve">Official PIB Link: </w:t>
+      </w:r>
+      <w:hyperlink r:id="rId16">
+        <w:r>
+          <w:rPr>
+            <w:color w:val="0284C7"/>
+            <w:u w:val="single"/>
+            <w:sz w:val="18"/>
+          </w:rPr>
+          <w:t>https://www.pib.gov.in/PressReleaseDetail.aspx?PRID=2319486</w:t>
+        </w:r>
+      </w:hyperlink>
+      <w:r>
         <w:br/>
       </w:r>
     </w:p>
@@ -472,7 +629,7 @@
         <w:rPr>
           <w:b/>
         </w:rPr>
-        <w:t xml:space="preserve">6. </w:t>
+        <w:t xml:space="preserve">7. </w:t>
       </w:r>
       <w:r>
         <w:rPr>
@@ -509,10 +666,23 @@
       </w:r>
       <w:r>
         <w:rPr>
-          <w:color w:val="0284C7"/>
+          <w:b/>
+          <w:color w:val="475569"/>
           <w:sz w:val="18"/>
         </w:rPr>
-        <w:t>Official PIB Link: https://www.pib.gov.in/PressReleaseDetail.aspx?PRID=2319531</w:t>
+        <w:t xml:space="preserve">Official PIB Link: </w:t>
+      </w:r>
+      <w:hyperlink r:id="rId17">
+        <w:r>
+          <w:rPr>
+            <w:color w:val="0284C7"/>
+            <w:u w:val="single"/>
+            <w:sz w:val="18"/>
+          </w:rPr>
+          <w:t>https://www.pib.gov.in/PressReleaseDetail.aspx?PRID=2319531</w:t>
+        </w:r>
+      </w:hyperlink>
+      <w:r>
         <w:br/>
       </w:r>
     </w:p>
@@ -525,7 +695,7 @@
         <w:rPr>
           <w:b/>
         </w:rPr>
-        <w:t xml:space="preserve">7. </w:t>
+        <w:t xml:space="preserve">8. </w:t>
       </w:r>
       <w:r>
         <w:rPr>
@@ -562,10 +732,23 @@
       </w:r>
       <w:r>
         <w:rPr>
-          <w:color w:val="0284C7"/>
+          <w:b/>
+          <w:color w:val="475569"/>
           <w:sz w:val="18"/>
         </w:rPr>
-        <w:t>Official PIB Link: https://www.pib.gov.in/PressReleaseDetail.aspx?PRID=2319534</w:t>
+        <w:t xml:space="preserve">Official PIB Link: </w:t>
+      </w:r>
+      <w:hyperlink r:id="rId18">
+        <w:r>
+          <w:rPr>
+            <w:color w:val="0284C7"/>
+            <w:u w:val="single"/>
+            <w:sz w:val="18"/>
+          </w:rPr>
+          <w:t>https://www.pib.gov.in/PressReleaseDetail.aspx?PRID=2319534</w:t>
+        </w:r>
+      </w:hyperlink>
+      <w:r>
         <w:br/>
       </w:r>
     </w:p>
@@ -629,10 +812,23 @@
       </w:r>
       <w:r>
         <w:rPr>
-          <w:color w:val="0284C7"/>
+          <w:b/>
+          <w:color w:val="475569"/>
           <w:sz w:val="18"/>
         </w:rPr>
-        <w:t>Official PIB Link: https://www.pib.gov.in/PressReleaseDetail.aspx?PRID=2319589</w:t>
+        <w:t xml:space="preserve">Official PIB Link: </w:t>
+      </w:r>
+      <w:hyperlink r:id="rId19">
+        <w:r>
+          <w:rPr>
+            <w:color w:val="0284C7"/>
+            <w:u w:val="single"/>
+            <w:sz w:val="18"/>
+          </w:rPr>
+          <w:t>https://www.pib.gov.in/PressReleaseDetail.aspx?PRID=2319589</w:t>
+        </w:r>
+      </w:hyperlink>
+      <w:r>
         <w:br/>
       </w:r>
     </w:p>
@@ -682,10 +878,23 @@
       </w:r>
       <w:r>
         <w:rPr>
-          <w:color w:val="0284C7"/>
+          <w:b/>
+          <w:color w:val="475569"/>
           <w:sz w:val="18"/>
         </w:rPr>
-        <w:t>Official PIB Link: https://www.pib.gov.in/PressReleaseDetail.aspx?PRID=2319551</w:t>
+        <w:t xml:space="preserve">Official PIB Link: </w:t>
+      </w:r>
+      <w:hyperlink r:id="rId20">
+        <w:r>
+          <w:rPr>
+            <w:color w:val="0284C7"/>
+            <w:u w:val="single"/>
+            <w:sz w:val="18"/>
+          </w:rPr>
+          <w:t>https://www.pib.gov.in/PressReleaseDetail.aspx?PRID=2319551</w:t>
+        </w:r>
+      </w:hyperlink>
+      <w:r>
         <w:br/>
       </w:r>
     </w:p>
@@ -735,10 +944,23 @@
       </w:r>
       <w:r>
         <w:rPr>
-          <w:color w:val="0284C7"/>
+          <w:b/>
+          <w:color w:val="475569"/>
           <w:sz w:val="18"/>
         </w:rPr>
-        <w:t>Official PIB Link: https://www.pib.gov.in/PressReleaseDetail.aspx?PRID=2319481</w:t>
+        <w:t xml:space="preserve">Official PIB Link: </w:t>
+      </w:r>
+      <w:hyperlink r:id="rId21">
+        <w:r>
+          <w:rPr>
+            <w:color w:val="0284C7"/>
+            <w:u w:val="single"/>
+            <w:sz w:val="18"/>
+          </w:rPr>
+          <w:t>https://www.pib.gov.in/PressReleaseDetail.aspx?PRID=2319481</w:t>
+        </w:r>
+      </w:hyperlink>
+      <w:r>
         <w:br/>
       </w:r>
     </w:p>
@@ -788,10 +1010,23 @@
       </w:r>
       <w:r>
         <w:rPr>
-          <w:color w:val="0284C7"/>
+          <w:b/>
+          <w:color w:val="475569"/>
           <w:sz w:val="18"/>
         </w:rPr>
-        <w:t>Official PIB Link: https://www.pib.gov.in/PressReleaseDetail.aspx?PRID=2319694</w:t>
+        <w:t xml:space="preserve">Official PIB Link: </w:t>
+      </w:r>
+      <w:hyperlink r:id="rId22">
+        <w:r>
+          <w:rPr>
+            <w:color w:val="0284C7"/>
+            <w:u w:val="single"/>
+            <w:sz w:val="18"/>
+          </w:rPr>
+          <w:t>https://www.pib.gov.in/PressReleaseDetail.aspx?PRID=2319694</w:t>
+        </w:r>
+      </w:hyperlink>
+      <w:r>
         <w:br/>
       </w:r>
     </w:p>
@@ -841,10 +1076,23 @@
       </w:r>
       <w:r>
         <w:rPr>
-          <w:color w:val="0284C7"/>
+          <w:b/>
+          <w:color w:val="475569"/>
           <w:sz w:val="18"/>
         </w:rPr>
-        <w:t>Official PIB Link: https://www.pib.gov.in/PressReleaseDetail.aspx?PRID=2319611</w:t>
+        <w:t xml:space="preserve">Official PIB Link: </w:t>
+      </w:r>
+      <w:hyperlink r:id="rId23">
+        <w:r>
+          <w:rPr>
+            <w:color w:val="0284C7"/>
+            <w:u w:val="single"/>
+            <w:sz w:val="18"/>
+          </w:rPr>
+          <w:t>https://www.pib.gov.in/PressReleaseDetail.aspx?PRID=2319611</w:t>
+        </w:r>
+      </w:hyperlink>
+      <w:r>
         <w:br/>
       </w:r>
     </w:p>
@@ -894,10 +1142,23 @@
       </w:r>
       <w:r>
         <w:rPr>
-          <w:color w:val="0284C7"/>
+          <w:b/>
+          <w:color w:val="475569"/>
           <w:sz w:val="18"/>
         </w:rPr>
-        <w:t>Official PIB Link: https://www.pib.gov.in/PressReleaseDetail.aspx?PRID=2319696</w:t>
+        <w:t xml:space="preserve">Official PIB Link: </w:t>
+      </w:r>
+      <w:hyperlink r:id="rId24">
+        <w:r>
+          <w:rPr>
+            <w:color w:val="0284C7"/>
+            <w:u w:val="single"/>
+            <w:sz w:val="18"/>
+          </w:rPr>
+          <w:t>https://www.pib.gov.in/PressReleaseDetail.aspx?PRID=2319696</w:t>
+        </w:r>
+      </w:hyperlink>
+      <w:r>
         <w:br/>
       </w:r>
     </w:p>
@@ -947,10 +1208,23 @@
       </w:r>
       <w:r>
         <w:rPr>
-          <w:color w:val="0284C7"/>
+          <w:b/>
+          <w:color w:val="475569"/>
           <w:sz w:val="18"/>
         </w:rPr>
-        <w:t>Official PIB Link: https://www.pib.gov.in/PressReleaseDetail.aspx?PRID=2319749</w:t>
+        <w:t xml:space="preserve">Official PIB Link: </w:t>
+      </w:r>
+      <w:hyperlink r:id="rId25">
+        <w:r>
+          <w:rPr>
+            <w:color w:val="0284C7"/>
+            <w:u w:val="single"/>
+            <w:sz w:val="18"/>
+          </w:rPr>
+          <w:t>https://www.pib.gov.in/PressReleaseDetail.aspx?PRID=2319749</w:t>
+        </w:r>
+      </w:hyperlink>
+      <w:r>
         <w:br/>
       </w:r>
     </w:p>

</xml_diff>

<commit_message>
Regenerate 06-10-2026 brief: 23 high-yield articles with defence and science updates
</commit_message>
<xml_diff>
--- a/output/PIB_UPSC_Daily_2026-10-06.docx
+++ b/output/PIB_UPSC_Daily_2026-10-06.docx
@@ -53,7 +53,7 @@
                 <w:b/>
                 <w:sz w:val="20"/>
               </w:rPr>
-              <w:t>DAILY SUMMARY: Scraped 56 total PIB releases today. Found 17 high-yield articles aligned with the UPSC syllabus (GS-1: 2, GS-2: 8, GS-3: 7).</w:t>
+              <w:t>DAILY SUMMARY: Scraped 57 total PIB releases today. Found 23 high-yield articles aligned with the UPSC syllabus (GS-1: 2, GS-2: 9, GS-3: 12).</w:t>
             </w:r>
           </w:p>
         </w:tc>
@@ -637,6 +637,72 @@
           <w:b/>
           <w:sz w:val="23"/>
         </w:rPr>
+        <w:t>ECI Clarifies Protocol for Meetings with Political Delegations, Says No Political Party Sought Appointment Before 4 PM Today</w:t>
+        <w:br/>
+      </w:r>
+    </w:p>
+    <w:p>
+      <w:pPr>
+        <w:spacing w:after="40"/>
+        <w:ind w:left="576"/>
+      </w:pPr>
+      <w:r>
+        <w:rPr>
+          <w:i/>
+          <w:color w:val="64748B"/>
+          <w:sz w:val="19"/>
+        </w:rPr>
+        <w:t>Ministry: Election Commission  |  Keywords: election commission</w:t>
+        <w:br/>
+      </w:r>
+      <w:r>
+        <w:rPr>
+          <w:b/>
+          <w:color w:val="1E40AF"/>
+          <w:sz w:val="20"/>
+        </w:rPr>
+        <w:t>UPSC Alignment: Aligned with General Studies 2 topics: election commission</w:t>
+        <w:br/>
+      </w:r>
+      <w:r>
+        <w:rPr>
+          <w:b/>
+          <w:color w:val="475569"/>
+          <w:sz w:val="18"/>
+        </w:rPr>
+        <w:t xml:space="preserve">Official PIB Link: </w:t>
+      </w:r>
+      <w:hyperlink r:id="rId17">
+        <w:r>
+          <w:rPr>
+            <w:color w:val="0284C7"/>
+            <w:u w:val="single"/>
+            <w:sz w:val="18"/>
+          </w:rPr>
+          <w:t>https://www.pib.gov.in/PressReleaseDetail.aspx?PRID=2319864</w:t>
+        </w:r>
+      </w:hyperlink>
+      <w:r>
+        <w:br/>
+      </w:r>
+    </w:p>
+    <w:p>
+      <w:pPr>
+        <w:spacing w:before="80" w:after="40"/>
+        <w:ind w:left="288"/>
+      </w:pPr>
+      <w:r>
+        <w:rPr>
+          <w:b/>
+        </w:rPr>
+        <w:t xml:space="preserve">8. </w:t>
+      </w:r>
+      <w:r>
+        <w:rPr>
+          <w:rFonts w:ascii="Calibri" w:hAnsi="Calibri"/>
+          <w:b/>
+          <w:sz w:val="23"/>
+        </w:rPr>
         <w:t>Cabinet approves setting up of Integrated Transport &amp; Logistics Authority</w:t>
         <w:br/>
       </w:r>
@@ -672,7 +738,7 @@
         </w:rPr>
         <w:t xml:space="preserve">Official PIB Link: </w:t>
       </w:r>
-      <w:hyperlink r:id="rId17">
+      <w:hyperlink r:id="rId18">
         <w:r>
           <w:rPr>
             <w:color w:val="0284C7"/>
@@ -695,7 +761,7 @@
         <w:rPr>
           <w:b/>
         </w:rPr>
-        <w:t xml:space="preserve">8. </w:t>
+        <w:t xml:space="preserve">9. </w:t>
       </w:r>
       <w:r>
         <w:rPr>
@@ -738,7 +804,7 @@
         </w:rPr>
         <w:t xml:space="preserve">Official PIB Link: </w:t>
       </w:r>
-      <w:hyperlink r:id="rId18">
+      <w:hyperlink r:id="rId19">
         <w:r>
           <w:rPr>
             <w:color w:val="0284C7"/>
@@ -783,6 +849,204 @@
           <w:b/>
           <w:sz w:val="23"/>
         </w:rPr>
+        <w:t>Government appoints Air Marshal Ashutosh Dixit, PVSM, AVSM, VM, VSM as Chief of the Air Staff (CAS)</w:t>
+        <w:br/>
+      </w:r>
+    </w:p>
+    <w:p>
+      <w:pPr>
+        <w:spacing w:after="40"/>
+        <w:ind w:left="576"/>
+      </w:pPr>
+      <w:r>
+        <w:rPr>
+          <w:i/>
+          <w:color w:val="64748B"/>
+          <w:sz w:val="19"/>
+        </w:rPr>
+        <w:t>Ministry: Ministry of Defence  |  Keywords: chief of the air staff, air marshal</w:t>
+        <w:br/>
+      </w:r>
+      <w:r>
+        <w:rPr>
+          <w:b/>
+          <w:color w:val="1E40AF"/>
+          <w:sz w:val="20"/>
+        </w:rPr>
+        <w:t>UPSC Alignment: Aligned with General Studies 3 topics: chief of the air staff, air marshal</w:t>
+        <w:br/>
+      </w:r>
+      <w:r>
+        <w:rPr>
+          <w:b/>
+          <w:color w:val="475569"/>
+          <w:sz w:val="18"/>
+        </w:rPr>
+        <w:t xml:space="preserve">Official PIB Link: </w:t>
+      </w:r>
+      <w:hyperlink r:id="rId20">
+        <w:r>
+          <w:rPr>
+            <w:color w:val="0284C7"/>
+            <w:u w:val="single"/>
+            <w:sz w:val="18"/>
+          </w:rPr>
+          <w:t>https://www.pib.gov.in/PressReleaseDetail.aspx?PRID=2319822</w:t>
+        </w:r>
+      </w:hyperlink>
+      <w:r>
+        <w:br/>
+      </w:r>
+    </w:p>
+    <w:p>
+      <w:pPr>
+        <w:spacing w:before="80" w:after="40"/>
+        <w:ind w:left="288"/>
+      </w:pPr>
+      <w:r>
+        <w:rPr>
+          <w:b/>
+        </w:rPr>
+        <w:t xml:space="preserve">2. </w:t>
+      </w:r>
+      <w:r>
+        <w:rPr>
+          <w:rFonts w:ascii="Calibri" w:hAnsi="Calibri"/>
+          <w:b/>
+          <w:sz w:val="23"/>
+        </w:rPr>
+        <w:t>Government appoints Air Marshal Ashutosh Dixit, PVSM, AVSM, VM, VSM as Chief of the Air Staff (CAS)</w:t>
+        <w:br/>
+      </w:r>
+    </w:p>
+    <w:p>
+      <w:pPr>
+        <w:spacing w:after="40"/>
+        <w:ind w:left="576"/>
+      </w:pPr>
+      <w:r>
+        <w:rPr>
+          <w:i/>
+          <w:color w:val="64748B"/>
+          <w:sz w:val="19"/>
+        </w:rPr>
+        <w:t>Ministry: Ministry of Defence  |  Keywords: chief of the air staff, air marshal</w:t>
+        <w:br/>
+      </w:r>
+      <w:r>
+        <w:rPr>
+          <w:b/>
+          <w:color w:val="1E40AF"/>
+          <w:sz w:val="20"/>
+        </w:rPr>
+        <w:t>UPSC Alignment: Aligned with General Studies 3 topics: chief of the air staff, air marshal</w:t>
+        <w:br/>
+      </w:r>
+      <w:r>
+        <w:rPr>
+          <w:b/>
+          <w:color w:val="475569"/>
+          <w:sz w:val="18"/>
+        </w:rPr>
+        <w:t xml:space="preserve">Official PIB Link: </w:t>
+      </w:r>
+      <w:hyperlink r:id="rId21">
+        <w:r>
+          <w:rPr>
+            <w:color w:val="0284C7"/>
+            <w:u w:val="single"/>
+            <w:sz w:val="18"/>
+          </w:rPr>
+          <w:t>https://www.pib.gov.in/PressReleaseDetail.aspx?PRID=2319762</w:t>
+        </w:r>
+      </w:hyperlink>
+      <w:r>
+        <w:br/>
+      </w:r>
+    </w:p>
+    <w:p>
+      <w:pPr>
+        <w:spacing w:before="80" w:after="40"/>
+        <w:ind w:left="288"/>
+      </w:pPr>
+      <w:r>
+        <w:rPr>
+          <w:b/>
+        </w:rPr>
+        <w:t xml:space="preserve">3. </w:t>
+      </w:r>
+      <w:r>
+        <w:rPr>
+          <w:rFonts w:ascii="Calibri" w:hAnsi="Calibri"/>
+          <w:b/>
+          <w:sz w:val="23"/>
+        </w:rPr>
+        <w:t>Raksha Rajya Mantri Shri Sanjay Seth to inaugurate SAREX-2026 off Paradip coast</w:t>
+        <w:br/>
+      </w:r>
+    </w:p>
+    <w:p>
+      <w:pPr>
+        <w:spacing w:after="40"/>
+        <w:ind w:left="576"/>
+      </w:pPr>
+      <w:r>
+        <w:rPr>
+          <w:i/>
+          <w:color w:val="64748B"/>
+          <w:sz w:val="19"/>
+        </w:rPr>
+        <w:t>Ministry: Ministry of Defence  |  Keywords: sarex</w:t>
+        <w:br/>
+      </w:r>
+      <w:r>
+        <w:rPr>
+          <w:b/>
+          <w:color w:val="1E40AF"/>
+          <w:sz w:val="20"/>
+        </w:rPr>
+        <w:t>UPSC Alignment: Aligned with General Studies 3 topics: sarex</w:t>
+        <w:br/>
+      </w:r>
+      <w:r>
+        <w:rPr>
+          <w:b/>
+          <w:color w:val="475569"/>
+          <w:sz w:val="18"/>
+        </w:rPr>
+        <w:t xml:space="preserve">Official PIB Link: </w:t>
+      </w:r>
+      <w:hyperlink r:id="rId22">
+        <w:r>
+          <w:rPr>
+            <w:color w:val="0284C7"/>
+            <w:u w:val="single"/>
+            <w:sz w:val="18"/>
+          </w:rPr>
+          <w:t>https://www.pib.gov.in/PressReleaseDetail.aspx?PRID=2319740</w:t>
+        </w:r>
+      </w:hyperlink>
+      <w:r>
+        <w:br/>
+      </w:r>
+    </w:p>
+    <w:p>
+      <w:pPr>
+        <w:spacing w:before="80" w:after="40"/>
+        <w:ind w:left="288"/>
+      </w:pPr>
+      <w:r>
+        <w:rPr>
+          <w:b/>
+        </w:rPr>
+        <w:t xml:space="preserve">4. </w:t>
+      </w:r>
+      <w:r>
+        <w:rPr>
+          <w:rFonts w:ascii="Calibri" w:hAnsi="Calibri"/>
+          <w:b/>
+          <w:sz w:val="23"/>
+        </w:rPr>
         <w:t>DRDO Conducts Maiden Live Jump of Advanced High-Altitude Parachute</w:t>
         <w:br/>
       </w:r>
@@ -818,7 +1082,7 @@
         </w:rPr>
         <w:t xml:space="preserve">Official PIB Link: </w:t>
       </w:r>
-      <w:hyperlink r:id="rId19">
+      <w:hyperlink r:id="rId23">
         <w:r>
           <w:rPr>
             <w:color w:val="0284C7"/>
@@ -841,7 +1105,7 @@
         <w:rPr>
           <w:b/>
         </w:rPr>
-        <w:t xml:space="preserve">2. </w:t>
+        <w:t xml:space="preserve">5. </w:t>
       </w:r>
       <w:r>
         <w:rPr>
@@ -884,7 +1148,7 @@
         </w:rPr>
         <w:t xml:space="preserve">Official PIB Link: </w:t>
       </w:r>
-      <w:hyperlink r:id="rId20">
+      <w:hyperlink r:id="rId24">
         <w:r>
           <w:rPr>
             <w:color w:val="0284C7"/>
@@ -907,7 +1171,73 @@
         <w:rPr>
           <w:b/>
         </w:rPr>
-        <w:t xml:space="preserve">3. </w:t>
+        <w:t xml:space="preserve">6. </w:t>
+      </w:r>
+      <w:r>
+        <w:rPr>
+          <w:rFonts w:ascii="Calibri" w:hAnsi="Calibri"/>
+          <w:b/>
+          <w:sz w:val="23"/>
+        </w:rPr>
+        <w:t>MoD signs Rs 661 crore contract to procure BrahMos Fire Control System and Launchers for Indian Navy ships</w:t>
+        <w:br/>
+      </w:r>
+    </w:p>
+    <w:p>
+      <w:pPr>
+        <w:spacing w:after="40"/>
+        <w:ind w:left="576"/>
+      </w:pPr>
+      <w:r>
+        <w:rPr>
+          <w:i/>
+          <w:color w:val="64748B"/>
+          <w:sz w:val="19"/>
+        </w:rPr>
+        <w:t>Ministry: Ministry of Defence  |  Keywords: indian navy</w:t>
+        <w:br/>
+      </w:r>
+      <w:r>
+        <w:rPr>
+          <w:b/>
+          <w:color w:val="1E40AF"/>
+          <w:sz w:val="20"/>
+        </w:rPr>
+        <w:t>UPSC Alignment: Aligned with General Studies 3 topics: indian navy</w:t>
+        <w:br/>
+      </w:r>
+      <w:r>
+        <w:rPr>
+          <w:b/>
+          <w:color w:val="475569"/>
+          <w:sz w:val="18"/>
+        </w:rPr>
+        <w:t xml:space="preserve">Official PIB Link: </w:t>
+      </w:r>
+      <w:hyperlink r:id="rId25">
+        <w:r>
+          <w:rPr>
+            <w:color w:val="0284C7"/>
+            <w:u w:val="single"/>
+            <w:sz w:val="18"/>
+          </w:rPr>
+          <w:t>https://www.pib.gov.in/PressReleaseDetail.aspx?PRID=2319502</w:t>
+        </w:r>
+      </w:hyperlink>
+      <w:r>
+        <w:br/>
+      </w:r>
+    </w:p>
+    <w:p>
+      <w:pPr>
+        <w:spacing w:before="80" w:after="40"/>
+        <w:ind w:left="288"/>
+      </w:pPr>
+      <w:r>
+        <w:rPr>
+          <w:b/>
+        </w:rPr>
+        <w:t xml:space="preserve">7. </w:t>
       </w:r>
       <w:r>
         <w:rPr>
@@ -950,7 +1280,7 @@
         </w:rPr>
         <w:t xml:space="preserve">Official PIB Link: </w:t>
       </w:r>
-      <w:hyperlink r:id="rId21">
+      <w:hyperlink r:id="rId26">
         <w:r>
           <w:rPr>
             <w:color w:val="0284C7"/>
@@ -973,7 +1303,7 @@
         <w:rPr>
           <w:b/>
         </w:rPr>
-        <w:t xml:space="preserve">4. </w:t>
+        <w:t xml:space="preserve">8. </w:t>
       </w:r>
       <w:r>
         <w:rPr>
@@ -1016,7 +1346,7 @@
         </w:rPr>
         <w:t xml:space="preserve">Official PIB Link: </w:t>
       </w:r>
-      <w:hyperlink r:id="rId22">
+      <w:hyperlink r:id="rId27">
         <w:r>
           <w:rPr>
             <w:color w:val="0284C7"/>
@@ -1039,7 +1369,7 @@
         <w:rPr>
           <w:b/>
         </w:rPr>
-        <w:t xml:space="preserve">5. </w:t>
+        <w:t xml:space="preserve">9. </w:t>
       </w:r>
       <w:r>
         <w:rPr>
@@ -1082,7 +1412,7 @@
         </w:rPr>
         <w:t xml:space="preserve">Official PIB Link: </w:t>
       </w:r>
-      <w:hyperlink r:id="rId23">
+      <w:hyperlink r:id="rId28">
         <w:r>
           <w:rPr>
             <w:color w:val="0284C7"/>
@@ -1105,7 +1435,7 @@
         <w:rPr>
           <w:b/>
         </w:rPr>
-        <w:t xml:space="preserve">6. </w:t>
+        <w:t xml:space="preserve">10. </w:t>
       </w:r>
       <w:r>
         <w:rPr>
@@ -1148,7 +1478,7 @@
         </w:rPr>
         <w:t xml:space="preserve">Official PIB Link: </w:t>
       </w:r>
-      <w:hyperlink r:id="rId24">
+      <w:hyperlink r:id="rId29">
         <w:r>
           <w:rPr>
             <w:color w:val="0284C7"/>
@@ -1171,7 +1501,7 @@
         <w:rPr>
           <w:b/>
         </w:rPr>
-        <w:t xml:space="preserve">7. </w:t>
+        <w:t xml:space="preserve">11. </w:t>
       </w:r>
       <w:r>
         <w:rPr>
@@ -1214,7 +1544,7 @@
         </w:rPr>
         <w:t xml:space="preserve">Official PIB Link: </w:t>
       </w:r>
-      <w:hyperlink r:id="rId25">
+      <w:hyperlink r:id="rId30">
         <w:r>
           <w:rPr>
             <w:color w:val="0284C7"/>
@@ -1222,6 +1552,72 @@
             <w:sz w:val="18"/>
           </w:rPr>
           <w:t>https://www.pib.gov.in/PressReleaseDetail.aspx?PRID=2319749</w:t>
+        </w:r>
+      </w:hyperlink>
+      <w:r>
+        <w:br/>
+      </w:r>
+    </w:p>
+    <w:p>
+      <w:pPr>
+        <w:spacing w:before="80" w:after="40"/>
+        <w:ind w:left="288"/>
+      </w:pPr>
+      <w:r>
+        <w:rPr>
+          <w:b/>
+        </w:rPr>
+        <w:t xml:space="preserve">12. </w:t>
+      </w:r>
+      <w:r>
+        <w:rPr>
+          <w:rFonts w:ascii="Calibri" w:hAnsi="Calibri"/>
+          <w:b/>
+          <w:sz w:val="23"/>
+        </w:rPr>
+        <w:t>A decade of cosmic flickering reveals new clues about a rare giant binary black hole system</w:t>
+        <w:br/>
+      </w:r>
+    </w:p>
+    <w:p>
+      <w:pPr>
+        <w:spacing w:after="40"/>
+        <w:ind w:left="576"/>
+      </w:pPr>
+      <w:r>
+        <w:rPr>
+          <w:i/>
+          <w:color w:val="64748B"/>
+          <w:sz w:val="19"/>
+        </w:rPr>
+        <w:t>Ministry: Ministry of Science &amp; Technology  |  Keywords: black hole, binary black hole, cosmic</w:t>
+        <w:br/>
+      </w:r>
+      <w:r>
+        <w:rPr>
+          <w:b/>
+          <w:color w:val="1E40AF"/>
+          <w:sz w:val="20"/>
+        </w:rPr>
+        <w:t>UPSC Alignment: Aligned with General Studies 3 topics: black hole, binary black hole, cosmic</w:t>
+        <w:br/>
+      </w:r>
+      <w:r>
+        <w:rPr>
+          <w:b/>
+          <w:color w:val="475569"/>
+          <w:sz w:val="18"/>
+        </w:rPr>
+        <w:t xml:space="preserve">Official PIB Link: </w:t>
+      </w:r>
+      <w:hyperlink r:id="rId31">
+        <w:r>
+          <w:rPr>
+            <w:color w:val="0284C7"/>
+            <w:u w:val="single"/>
+            <w:sz w:val="18"/>
+          </w:rPr>
+          <w:t>https://www.pib.gov.in/PressReleaseDetail.aspx?PRID=2319522</w:t>
         </w:r>
       </w:hyperlink>
       <w:r>

</xml_diff>

<commit_message>
Implement 4-pillar UPSC CSE noise filtering and cross-ministry deduplication
</commit_message>
<xml_diff>
--- a/output/PIB_UPSC_Daily_2026-10-06.docx
+++ b/output/PIB_UPSC_Daily_2026-10-06.docx
@@ -53,7 +53,7 @@
                 <w:b/>
                 <w:sz w:val="20"/>
               </w:rPr>
-              <w:t>DAILY SUMMARY: Scraped 57 total PIB releases today. Found 23 high-yield articles aligned with the UPSC syllabus (GS-1: 2, GS-2: 9, GS-3: 12).</w:t>
+              <w:t>DAILY SUMMARY: Scraped 57 total PIB releases today. Found 10 high-yield articles aligned with the UPSC syllabus (GS-1: 1, GS-2: 2, GS-3: 7).</w:t>
             </w:r>
           </w:p>
         </w:tc>
@@ -88,72 +88,6 @@
           <w:b/>
         </w:rPr>
         <w:t xml:space="preserve">1. </w:t>
-      </w:r>
-      <w:r>
-        <w:rPr>
-          <w:rFonts w:ascii="Calibri" w:hAnsi="Calibri"/>
-          <w:b/>
-          <w:sz w:val="23"/>
-        </w:rPr>
-        <w:t>PM Mementos Brings Sikkim’s Cultural Heritage Closer to Citizens</w:t>
-        <w:br/>
-      </w:r>
-    </w:p>
-    <w:p>
-      <w:pPr>
-        <w:spacing w:after="40"/>
-        <w:ind w:left="576"/>
-      </w:pPr>
-      <w:r>
-        <w:rPr>
-          <w:i/>
-          <w:color w:val="64748B"/>
-          <w:sz w:val="19"/>
-        </w:rPr>
-        <w:t>Ministry: Ministry of Culture  |  Keywords: heritage</w:t>
-        <w:br/>
-      </w:r>
-      <w:r>
-        <w:rPr>
-          <w:b/>
-          <w:color w:val="1E40AF"/>
-          <w:sz w:val="20"/>
-        </w:rPr>
-        <w:t>UPSC Alignment: Aligned with General Studies 1 topics: heritage</w:t>
-        <w:br/>
-      </w:r>
-      <w:r>
-        <w:rPr>
-          <w:b/>
-          <w:color w:val="475569"/>
-          <w:sz w:val="18"/>
-        </w:rPr>
-        <w:t xml:space="preserve">Official PIB Link: </w:t>
-      </w:r>
-      <w:hyperlink r:id="rId9">
-        <w:r>
-          <w:rPr>
-            <w:color w:val="0284C7"/>
-            <w:u w:val="single"/>
-            <w:sz w:val="18"/>
-          </w:rPr>
-          <w:t>https://www.pib.gov.in/PressReleaseDetail.aspx?PRID=2319721</w:t>
-        </w:r>
-      </w:hyperlink>
-      <w:r>
-        <w:br/>
-      </w:r>
-    </w:p>
-    <w:p>
-      <w:pPr>
-        <w:spacing w:before="80" w:after="40"/>
-        <w:ind w:left="288"/>
-      </w:pPr>
-      <w:r>
-        <w:rPr>
-          <w:b/>
-        </w:rPr>
-        <w:t xml:space="preserve">2. </w:t>
       </w:r>
       <w:r>
         <w:rPr>
@@ -196,7 +130,7 @@
         </w:rPr>
         <w:t xml:space="preserve">Official PIB Link: </w:t>
       </w:r>
-      <w:hyperlink r:id="rId10">
+      <w:hyperlink r:id="rId9">
         <w:r>
           <w:rPr>
             <w:color w:val="0284C7"/>
@@ -241,204 +175,6 @@
           <w:b/>
           <w:sz w:val="23"/>
         </w:rPr>
-        <w:t>STRONG DEMOCRACIES ARE BUILT ON DIALOGUE, DIVERSE VIEWS AND MEANINGFUL PUBLIC PARTICIPATION: LOK SABHA SPEAKER</w:t>
-        <w:br/>
-      </w:r>
-    </w:p>
-    <w:p>
-      <w:pPr>
-        <w:spacing w:after="40"/>
-        <w:ind w:left="576"/>
-      </w:pPr>
-      <w:r>
-        <w:rPr>
-          <w:i/>
-          <w:color w:val="64748B"/>
-          <w:sz w:val="19"/>
-        </w:rPr>
-        <w:t>Ministry: Lok Sabha Secretariat  |  Keywords: lok sabha</w:t>
-        <w:br/>
-      </w:r>
-      <w:r>
-        <w:rPr>
-          <w:b/>
-          <w:color w:val="1E40AF"/>
-          <w:sz w:val="20"/>
-        </w:rPr>
-        <w:t>UPSC Alignment: Aligned with General Studies 2 topics: lok sabha</w:t>
-        <w:br/>
-      </w:r>
-      <w:r>
-        <w:rPr>
-          <w:b/>
-          <w:color w:val="475569"/>
-          <w:sz w:val="18"/>
-        </w:rPr>
-        <w:t xml:space="preserve">Official PIB Link: </w:t>
-      </w:r>
-      <w:hyperlink r:id="rId11">
-        <w:r>
-          <w:rPr>
-            <w:color w:val="0284C7"/>
-            <w:u w:val="single"/>
-            <w:sz w:val="18"/>
-          </w:rPr>
-          <w:t>https://www.pib.gov.in/PressReleaseDetail.aspx?PRID=2319828</w:t>
-        </w:r>
-      </w:hyperlink>
-      <w:r>
-        <w:br/>
-      </w:r>
-    </w:p>
-    <w:p>
-      <w:pPr>
-        <w:spacing w:before="80" w:after="40"/>
-        <w:ind w:left="288"/>
-      </w:pPr>
-      <w:r>
-        <w:rPr>
-          <w:b/>
-        </w:rPr>
-        <w:t xml:space="preserve">2. </w:t>
-      </w:r>
-      <w:r>
-        <w:rPr>
-          <w:rFonts w:ascii="Calibri" w:hAnsi="Calibri"/>
-          <w:b/>
-          <w:sz w:val="23"/>
-        </w:rPr>
-        <w:t>STRONG DEMOCRACIES ARE BUILT ON DIALOGUE, DIVERSE VIEWS AND MEANINGFUL PUBLIC PARTICIPATION: LOK SABHA SPEAKER</w:t>
-        <w:br/>
-      </w:r>
-    </w:p>
-    <w:p>
-      <w:pPr>
-        <w:spacing w:after="40"/>
-        <w:ind w:left="576"/>
-      </w:pPr>
-      <w:r>
-        <w:rPr>
-          <w:i/>
-          <w:color w:val="64748B"/>
-          <w:sz w:val="19"/>
-        </w:rPr>
-        <w:t>Ministry: Lok Sabha Secretariat  |  Keywords: lok sabha</w:t>
-        <w:br/>
-      </w:r>
-      <w:r>
-        <w:rPr>
-          <w:b/>
-          <w:color w:val="1E40AF"/>
-          <w:sz w:val="20"/>
-        </w:rPr>
-        <w:t>UPSC Alignment: Aligned with General Studies 2 topics: lok sabha</w:t>
-        <w:br/>
-      </w:r>
-      <w:r>
-        <w:rPr>
-          <w:b/>
-          <w:color w:val="475569"/>
-          <w:sz w:val="18"/>
-        </w:rPr>
-        <w:t xml:space="preserve">Official PIB Link: </w:t>
-      </w:r>
-      <w:hyperlink r:id="rId12">
-        <w:r>
-          <w:rPr>
-            <w:color w:val="0284C7"/>
-            <w:u w:val="single"/>
-            <w:sz w:val="18"/>
-          </w:rPr>
-          <w:t>https://www.pib.gov.in/PressReleaseDetail.aspx?PRID=2319796</w:t>
-        </w:r>
-      </w:hyperlink>
-      <w:r>
-        <w:br/>
-      </w:r>
-    </w:p>
-    <w:p>
-      <w:pPr>
-        <w:spacing w:before="80" w:after="40"/>
-        <w:ind w:left="288"/>
-      </w:pPr>
-      <w:r>
-        <w:rPr>
-          <w:b/>
-        </w:rPr>
-        <w:t xml:space="preserve">3. </w:t>
-      </w:r>
-      <w:r>
-        <w:rPr>
-          <w:rFonts w:ascii="Calibri" w:hAnsi="Calibri"/>
-          <w:b/>
-          <w:sz w:val="23"/>
-        </w:rPr>
-        <w:t>Prime Minister shares an article on how India’s water-governance model is offering useful lessons for the wider Global South</w:t>
-        <w:br/>
-      </w:r>
-    </w:p>
-    <w:p>
-      <w:pPr>
-        <w:spacing w:after="40"/>
-        <w:ind w:left="576"/>
-      </w:pPr>
-      <w:r>
-        <w:rPr>
-          <w:i/>
-          <w:color w:val="64748B"/>
-          <w:sz w:val="19"/>
-        </w:rPr>
-        <w:t>Ministry: Prime Minister's Office  |  Keywords: governance</w:t>
-        <w:br/>
-      </w:r>
-      <w:r>
-        <w:rPr>
-          <w:b/>
-          <w:color w:val="1E40AF"/>
-          <w:sz w:val="20"/>
-        </w:rPr>
-        <w:t>UPSC Alignment: Aligned with General Studies 2 topics: governance</w:t>
-        <w:br/>
-      </w:r>
-      <w:r>
-        <w:rPr>
-          <w:b/>
-          <w:color w:val="475569"/>
-          <w:sz w:val="18"/>
-        </w:rPr>
-        <w:t xml:space="preserve">Official PIB Link: </w:t>
-      </w:r>
-      <w:hyperlink r:id="rId13">
-        <w:r>
-          <w:rPr>
-            <w:color w:val="0284C7"/>
-            <w:u w:val="single"/>
-            <w:sz w:val="18"/>
-          </w:rPr>
-          <w:t>https://www.pib.gov.in/PressReleaseDetail.aspx?PRID=2319539</w:t>
-        </w:r>
-      </w:hyperlink>
-      <w:r>
-        <w:br/>
-      </w:r>
-    </w:p>
-    <w:p>
-      <w:pPr>
-        <w:spacing w:before="80" w:after="40"/>
-        <w:ind w:left="288"/>
-      </w:pPr>
-      <w:r>
-        <w:rPr>
-          <w:b/>
-        </w:rPr>
-        <w:t xml:space="preserve">4. </w:t>
-      </w:r>
-      <w:r>
-        <w:rPr>
-          <w:rFonts w:ascii="Calibri" w:hAnsi="Calibri"/>
-          <w:b/>
-          <w:sz w:val="23"/>
-        </w:rPr>
         <w:t>Cabinet approves Commitment of Rs.10,000 Crore towards establishment of the SME Growth Fund for direct equity investments in Small and Medium Enterprises to create future champions</w:t>
         <w:br/>
       </w:r>
@@ -474,7 +210,7 @@
         </w:rPr>
         <w:t xml:space="preserve">Official PIB Link: </w:t>
       </w:r>
-      <w:hyperlink r:id="rId14">
+      <w:hyperlink r:id="rId10">
         <w:r>
           <w:rPr>
             <w:color w:val="0284C7"/>
@@ -497,7 +233,7 @@
         <w:rPr>
           <w:b/>
         </w:rPr>
-        <w:t xml:space="preserve">5. </w:t>
+        <w:t xml:space="preserve">2. </w:t>
       </w:r>
       <w:r>
         <w:rPr>
@@ -540,7 +276,7 @@
         </w:rPr>
         <w:t xml:space="preserve">Official PIB Link: </w:t>
       </w:r>
-      <w:hyperlink r:id="rId15">
+      <w:hyperlink r:id="rId11">
         <w:r>
           <w:rPr>
             <w:color w:val="0284C7"/>
@@ -548,270 +284,6 @@
             <w:sz w:val="18"/>
           </w:rPr>
           <w:t>https://www.pib.gov.in/PressReleaseDetail.aspx?PRID=2319529</w:t>
-        </w:r>
-      </w:hyperlink>
-      <w:r>
-        <w:br/>
-      </w:r>
-    </w:p>
-    <w:p>
-      <w:pPr>
-        <w:spacing w:before="80" w:after="40"/>
-        <w:ind w:left="288"/>
-      </w:pPr>
-      <w:r>
-        <w:rPr>
-          <w:b/>
-        </w:rPr>
-        <w:t xml:space="preserve">6. </w:t>
-      </w:r>
-      <w:r>
-        <w:rPr>
-          <w:rFonts w:ascii="Calibri" w:hAnsi="Calibri"/>
-          <w:b/>
-          <w:sz w:val="23"/>
-        </w:rPr>
-        <w:t>PRESS RELEASE</w:t>
-        <w:br/>
-      </w:r>
-    </w:p>
-    <w:p>
-      <w:pPr>
-        <w:spacing w:after="40"/>
-        <w:ind w:left="576"/>
-      </w:pPr>
-      <w:r>
-        <w:rPr>
-          <w:i/>
-          <w:color w:val="64748B"/>
-          <w:sz w:val="19"/>
-        </w:rPr>
-        <w:t>Ministry: Rajya Sabha Secretariat  |  Keywords: rajya sabha</w:t>
-        <w:br/>
-      </w:r>
-      <w:r>
-        <w:rPr>
-          <w:b/>
-          <w:color w:val="1E40AF"/>
-          <w:sz w:val="20"/>
-        </w:rPr>
-        <w:t>UPSC Alignment: Aligned with General Studies 2 topics: rajya sabha</w:t>
-        <w:br/>
-      </w:r>
-      <w:r>
-        <w:rPr>
-          <w:b/>
-          <w:color w:val="475569"/>
-          <w:sz w:val="18"/>
-        </w:rPr>
-        <w:t xml:space="preserve">Official PIB Link: </w:t>
-      </w:r>
-      <w:hyperlink r:id="rId16">
-        <w:r>
-          <w:rPr>
-            <w:color w:val="0284C7"/>
-            <w:u w:val="single"/>
-            <w:sz w:val="18"/>
-          </w:rPr>
-          <w:t>https://www.pib.gov.in/PressReleaseDetail.aspx?PRID=2319486</w:t>
-        </w:r>
-      </w:hyperlink>
-      <w:r>
-        <w:br/>
-      </w:r>
-    </w:p>
-    <w:p>
-      <w:pPr>
-        <w:spacing w:before="80" w:after="40"/>
-        <w:ind w:left="288"/>
-      </w:pPr>
-      <w:r>
-        <w:rPr>
-          <w:b/>
-        </w:rPr>
-        <w:t xml:space="preserve">7. </w:t>
-      </w:r>
-      <w:r>
-        <w:rPr>
-          <w:rFonts w:ascii="Calibri" w:hAnsi="Calibri"/>
-          <w:b/>
-          <w:sz w:val="23"/>
-        </w:rPr>
-        <w:t>ECI Clarifies Protocol for Meetings with Political Delegations, Says No Political Party Sought Appointment Before 4 PM Today</w:t>
-        <w:br/>
-      </w:r>
-    </w:p>
-    <w:p>
-      <w:pPr>
-        <w:spacing w:after="40"/>
-        <w:ind w:left="576"/>
-      </w:pPr>
-      <w:r>
-        <w:rPr>
-          <w:i/>
-          <w:color w:val="64748B"/>
-          <w:sz w:val="19"/>
-        </w:rPr>
-        <w:t>Ministry: Election Commission  |  Keywords: election commission</w:t>
-        <w:br/>
-      </w:r>
-      <w:r>
-        <w:rPr>
-          <w:b/>
-          <w:color w:val="1E40AF"/>
-          <w:sz w:val="20"/>
-        </w:rPr>
-        <w:t>UPSC Alignment: Aligned with General Studies 2 topics: election commission</w:t>
-        <w:br/>
-      </w:r>
-      <w:r>
-        <w:rPr>
-          <w:b/>
-          <w:color w:val="475569"/>
-          <w:sz w:val="18"/>
-        </w:rPr>
-        <w:t xml:space="preserve">Official PIB Link: </w:t>
-      </w:r>
-      <w:hyperlink r:id="rId17">
-        <w:r>
-          <w:rPr>
-            <w:color w:val="0284C7"/>
-            <w:u w:val="single"/>
-            <w:sz w:val="18"/>
-          </w:rPr>
-          <w:t>https://www.pib.gov.in/PressReleaseDetail.aspx?PRID=2319864</w:t>
-        </w:r>
-      </w:hyperlink>
-      <w:r>
-        <w:br/>
-      </w:r>
-    </w:p>
-    <w:p>
-      <w:pPr>
-        <w:spacing w:before="80" w:after="40"/>
-        <w:ind w:left="288"/>
-      </w:pPr>
-      <w:r>
-        <w:rPr>
-          <w:b/>
-        </w:rPr>
-        <w:t xml:space="preserve">8. </w:t>
-      </w:r>
-      <w:r>
-        <w:rPr>
-          <w:rFonts w:ascii="Calibri" w:hAnsi="Calibri"/>
-          <w:b/>
-          <w:sz w:val="23"/>
-        </w:rPr>
-        <w:t>Cabinet approves setting up of Integrated Transport &amp; Logistics Authority</w:t>
-        <w:br/>
-      </w:r>
-    </w:p>
-    <w:p>
-      <w:pPr>
-        <w:spacing w:after="40"/>
-        <w:ind w:left="576"/>
-      </w:pPr>
-      <w:r>
-        <w:rPr>
-          <w:i/>
-          <w:color w:val="64748B"/>
-          <w:sz w:val="19"/>
-        </w:rPr>
-        <w:t>Ministry: Ministry of Commerce &amp; Industry  |  Keywords: cabinet approves</w:t>
-        <w:br/>
-      </w:r>
-      <w:r>
-        <w:rPr>
-          <w:b/>
-          <w:color w:val="1E40AF"/>
-          <w:sz w:val="20"/>
-        </w:rPr>
-        <w:t>UPSC Alignment: Aligned with General Studies 2 topics: cabinet approves</w:t>
-        <w:br/>
-      </w:r>
-      <w:r>
-        <w:rPr>
-          <w:b/>
-          <w:color w:val="475569"/>
-          <w:sz w:val="18"/>
-        </w:rPr>
-        <w:t xml:space="preserve">Official PIB Link: </w:t>
-      </w:r>
-      <w:hyperlink r:id="rId18">
-        <w:r>
-          <w:rPr>
-            <w:color w:val="0284C7"/>
-            <w:u w:val="single"/>
-            <w:sz w:val="18"/>
-          </w:rPr>
-          <w:t>https://www.pib.gov.in/PressReleaseDetail.aspx?PRID=2319531</w:t>
-        </w:r>
-      </w:hyperlink>
-      <w:r>
-        <w:br/>
-      </w:r>
-    </w:p>
-    <w:p>
-      <w:pPr>
-        <w:spacing w:before="80" w:after="40"/>
-        <w:ind w:left="288"/>
-      </w:pPr>
-      <w:r>
-        <w:rPr>
-          <w:b/>
-        </w:rPr>
-        <w:t xml:space="preserve">9. </w:t>
-      </w:r>
-      <w:r>
-        <w:rPr>
-          <w:rFonts w:ascii="Calibri" w:hAnsi="Calibri"/>
-          <w:b/>
-          <w:sz w:val="23"/>
-        </w:rPr>
-        <w:t>Cabinet approves Commitment of Rs.10,000 Crore towards establishment of the SME Growth Fund for direct equity investments in Small and Medium Enterprises to create future champions</w:t>
-        <w:br/>
-      </w:r>
-    </w:p>
-    <w:p>
-      <w:pPr>
-        <w:spacing w:after="40"/>
-        <w:ind w:left="576"/>
-      </w:pPr>
-      <w:r>
-        <w:rPr>
-          <w:i/>
-          <w:color w:val="64748B"/>
-          <w:sz w:val="19"/>
-        </w:rPr>
-        <w:t>Ministry: Ministry of Finance  |  Keywords: cabinet approves</w:t>
-        <w:br/>
-      </w:r>
-      <w:r>
-        <w:rPr>
-          <w:b/>
-          <w:color w:val="1E40AF"/>
-          <w:sz w:val="20"/>
-        </w:rPr>
-        <w:t>UPSC Alignment: Aligned with General Studies 2 topics: cabinet approves</w:t>
-        <w:br/>
-      </w:r>
-      <w:r>
-        <w:rPr>
-          <w:b/>
-          <w:color w:val="475569"/>
-          <w:sz w:val="18"/>
-        </w:rPr>
-        <w:t xml:space="preserve">Official PIB Link: </w:t>
-      </w:r>
-      <w:hyperlink r:id="rId19">
-        <w:r>
-          <w:rPr>
-            <w:color w:val="0284C7"/>
-            <w:u w:val="single"/>
-            <w:sz w:val="18"/>
-          </w:rPr>
-          <w:t>https://www.pib.gov.in/PressReleaseDetail.aspx?PRID=2319534</w:t>
         </w:r>
       </w:hyperlink>
       <w:r>
@@ -842,138 +314,6 @@
           <w:b/>
         </w:rPr>
         <w:t xml:space="preserve">1. </w:t>
-      </w:r>
-      <w:r>
-        <w:rPr>
-          <w:rFonts w:ascii="Calibri" w:hAnsi="Calibri"/>
-          <w:b/>
-          <w:sz w:val="23"/>
-        </w:rPr>
-        <w:t>Government appoints Air Marshal Ashutosh Dixit, PVSM, AVSM, VM, VSM as Chief of the Air Staff (CAS)</w:t>
-        <w:br/>
-      </w:r>
-    </w:p>
-    <w:p>
-      <w:pPr>
-        <w:spacing w:after="40"/>
-        <w:ind w:left="576"/>
-      </w:pPr>
-      <w:r>
-        <w:rPr>
-          <w:i/>
-          <w:color w:val="64748B"/>
-          <w:sz w:val="19"/>
-        </w:rPr>
-        <w:t>Ministry: Ministry of Defence  |  Keywords: chief of the air staff, air marshal</w:t>
-        <w:br/>
-      </w:r>
-      <w:r>
-        <w:rPr>
-          <w:b/>
-          <w:color w:val="1E40AF"/>
-          <w:sz w:val="20"/>
-        </w:rPr>
-        <w:t>UPSC Alignment: Aligned with General Studies 3 topics: chief of the air staff, air marshal</w:t>
-        <w:br/>
-      </w:r>
-      <w:r>
-        <w:rPr>
-          <w:b/>
-          <w:color w:val="475569"/>
-          <w:sz w:val="18"/>
-        </w:rPr>
-        <w:t xml:space="preserve">Official PIB Link: </w:t>
-      </w:r>
-      <w:hyperlink r:id="rId20">
-        <w:r>
-          <w:rPr>
-            <w:color w:val="0284C7"/>
-            <w:u w:val="single"/>
-            <w:sz w:val="18"/>
-          </w:rPr>
-          <w:t>https://www.pib.gov.in/PressReleaseDetail.aspx?PRID=2319822</w:t>
-        </w:r>
-      </w:hyperlink>
-      <w:r>
-        <w:br/>
-      </w:r>
-    </w:p>
-    <w:p>
-      <w:pPr>
-        <w:spacing w:before="80" w:after="40"/>
-        <w:ind w:left="288"/>
-      </w:pPr>
-      <w:r>
-        <w:rPr>
-          <w:b/>
-        </w:rPr>
-        <w:t xml:space="preserve">2. </w:t>
-      </w:r>
-      <w:r>
-        <w:rPr>
-          <w:rFonts w:ascii="Calibri" w:hAnsi="Calibri"/>
-          <w:b/>
-          <w:sz w:val="23"/>
-        </w:rPr>
-        <w:t>Government appoints Air Marshal Ashutosh Dixit, PVSM, AVSM, VM, VSM as Chief of the Air Staff (CAS)</w:t>
-        <w:br/>
-      </w:r>
-    </w:p>
-    <w:p>
-      <w:pPr>
-        <w:spacing w:after="40"/>
-        <w:ind w:left="576"/>
-      </w:pPr>
-      <w:r>
-        <w:rPr>
-          <w:i/>
-          <w:color w:val="64748B"/>
-          <w:sz w:val="19"/>
-        </w:rPr>
-        <w:t>Ministry: Ministry of Defence  |  Keywords: chief of the air staff, air marshal</w:t>
-        <w:br/>
-      </w:r>
-      <w:r>
-        <w:rPr>
-          <w:b/>
-          <w:color w:val="1E40AF"/>
-          <w:sz w:val="20"/>
-        </w:rPr>
-        <w:t>UPSC Alignment: Aligned with General Studies 3 topics: chief of the air staff, air marshal</w:t>
-        <w:br/>
-      </w:r>
-      <w:r>
-        <w:rPr>
-          <w:b/>
-          <w:color w:val="475569"/>
-          <w:sz w:val="18"/>
-        </w:rPr>
-        <w:t xml:space="preserve">Official PIB Link: </w:t>
-      </w:r>
-      <w:hyperlink r:id="rId21">
-        <w:r>
-          <w:rPr>
-            <w:color w:val="0284C7"/>
-            <w:u w:val="single"/>
-            <w:sz w:val="18"/>
-          </w:rPr>
-          <w:t>https://www.pib.gov.in/PressReleaseDetail.aspx?PRID=2319762</w:t>
-        </w:r>
-      </w:hyperlink>
-      <w:r>
-        <w:br/>
-      </w:r>
-    </w:p>
-    <w:p>
-      <w:pPr>
-        <w:spacing w:before="80" w:after="40"/>
-        <w:ind w:left="288"/>
-      </w:pPr>
-      <w:r>
-        <w:rPr>
-          <w:b/>
-        </w:rPr>
-        <w:t xml:space="preserve">3. </w:t>
       </w:r>
       <w:r>
         <w:rPr>
@@ -1016,7 +356,7 @@
         </w:rPr>
         <w:t xml:space="preserve">Official PIB Link: </w:t>
       </w:r>
-      <w:hyperlink r:id="rId22">
+      <w:hyperlink r:id="rId12">
         <w:r>
           <w:rPr>
             <w:color w:val="0284C7"/>
@@ -1039,7 +379,7 @@
         <w:rPr>
           <w:b/>
         </w:rPr>
-        <w:t xml:space="preserve">4. </w:t>
+        <w:t xml:space="preserve">2. </w:t>
       </w:r>
       <w:r>
         <w:rPr>
@@ -1082,7 +422,7 @@
         </w:rPr>
         <w:t xml:space="preserve">Official PIB Link: </w:t>
       </w:r>
-      <w:hyperlink r:id="rId23">
+      <w:hyperlink r:id="rId13">
         <w:r>
           <w:rPr>
             <w:color w:val="0284C7"/>
@@ -1105,7 +445,7 @@
         <w:rPr>
           <w:b/>
         </w:rPr>
-        <w:t xml:space="preserve">5. </w:t>
+        <w:t xml:space="preserve">3. </w:t>
       </w:r>
       <w:r>
         <w:rPr>
@@ -1148,7 +488,7 @@
         </w:rPr>
         <w:t xml:space="preserve">Official PIB Link: </w:t>
       </w:r>
-      <w:hyperlink r:id="rId24">
+      <w:hyperlink r:id="rId14">
         <w:r>
           <w:rPr>
             <w:color w:val="0284C7"/>
@@ -1171,73 +511,7 @@
         <w:rPr>
           <w:b/>
         </w:rPr>
-        <w:t xml:space="preserve">6. </w:t>
-      </w:r>
-      <w:r>
-        <w:rPr>
-          <w:rFonts w:ascii="Calibri" w:hAnsi="Calibri"/>
-          <w:b/>
-          <w:sz w:val="23"/>
-        </w:rPr>
-        <w:t>MoD signs Rs 661 crore contract to procure BrahMos Fire Control System and Launchers for Indian Navy ships</w:t>
-        <w:br/>
-      </w:r>
-    </w:p>
-    <w:p>
-      <w:pPr>
-        <w:spacing w:after="40"/>
-        <w:ind w:left="576"/>
-      </w:pPr>
-      <w:r>
-        <w:rPr>
-          <w:i/>
-          <w:color w:val="64748B"/>
-          <w:sz w:val="19"/>
-        </w:rPr>
-        <w:t>Ministry: Ministry of Defence  |  Keywords: indian navy</w:t>
-        <w:br/>
-      </w:r>
-      <w:r>
-        <w:rPr>
-          <w:b/>
-          <w:color w:val="1E40AF"/>
-          <w:sz w:val="20"/>
-        </w:rPr>
-        <w:t>UPSC Alignment: Aligned with General Studies 3 topics: indian navy</w:t>
-        <w:br/>
-      </w:r>
-      <w:r>
-        <w:rPr>
-          <w:b/>
-          <w:color w:val="475569"/>
-          <w:sz w:val="18"/>
-        </w:rPr>
-        <w:t xml:space="preserve">Official PIB Link: </w:t>
-      </w:r>
-      <w:hyperlink r:id="rId25">
-        <w:r>
-          <w:rPr>
-            <w:color w:val="0284C7"/>
-            <w:u w:val="single"/>
-            <w:sz w:val="18"/>
-          </w:rPr>
-          <w:t>https://www.pib.gov.in/PressReleaseDetail.aspx?PRID=2319502</w:t>
-        </w:r>
-      </w:hyperlink>
-      <w:r>
-        <w:br/>
-      </w:r>
-    </w:p>
-    <w:p>
-      <w:pPr>
-        <w:spacing w:before="80" w:after="40"/>
-        <w:ind w:left="288"/>
-      </w:pPr>
-      <w:r>
-        <w:rPr>
-          <w:b/>
-        </w:rPr>
-        <w:t xml:space="preserve">7. </w:t>
+        <w:t xml:space="preserve">4. </w:t>
       </w:r>
       <w:r>
         <w:rPr>
@@ -1280,7 +554,7 @@
         </w:rPr>
         <w:t xml:space="preserve">Official PIB Link: </w:t>
       </w:r>
-      <w:hyperlink r:id="rId26">
+      <w:hyperlink r:id="rId15">
         <w:r>
           <w:rPr>
             <w:color w:val="0284C7"/>
@@ -1303,7 +577,7 @@
         <w:rPr>
           <w:b/>
         </w:rPr>
-        <w:t xml:space="preserve">8. </w:t>
+        <w:t xml:space="preserve">5. </w:t>
       </w:r>
       <w:r>
         <w:rPr>
@@ -1346,7 +620,7 @@
         </w:rPr>
         <w:t xml:space="preserve">Official PIB Link: </w:t>
       </w:r>
-      <w:hyperlink r:id="rId27">
+      <w:hyperlink r:id="rId16">
         <w:r>
           <w:rPr>
             <w:color w:val="0284C7"/>
@@ -1369,7 +643,7 @@
         <w:rPr>
           <w:b/>
         </w:rPr>
-        <w:t xml:space="preserve">9. </w:t>
+        <w:t xml:space="preserve">6. </w:t>
       </w:r>
       <w:r>
         <w:rPr>
@@ -1412,7 +686,7 @@
         </w:rPr>
         <w:t xml:space="preserve">Official PIB Link: </w:t>
       </w:r>
-      <w:hyperlink r:id="rId28">
+      <w:hyperlink r:id="rId17">
         <w:r>
           <w:rPr>
             <w:color w:val="0284C7"/>
@@ -1435,139 +709,7 @@
         <w:rPr>
           <w:b/>
         </w:rPr>
-        <w:t xml:space="preserve">10. </w:t>
-      </w:r>
-      <w:r>
-        <w:rPr>
-          <w:rFonts w:ascii="Calibri" w:hAnsi="Calibri"/>
-          <w:b/>
-          <w:sz w:val="23"/>
-        </w:rPr>
-        <w:t>Secretary, DFS, Shri Sanjay Lohiya chairs review meeting on progress of Financial Inclusion Schemes with senior executives of Public Sector and Private Sector Banks</w:t>
-        <w:br/>
-      </w:r>
-    </w:p>
-    <w:p>
-      <w:pPr>
-        <w:spacing w:after="40"/>
-        <w:ind w:left="576"/>
-      </w:pPr>
-      <w:r>
-        <w:rPr>
-          <w:i/>
-          <w:color w:val="64748B"/>
-          <w:sz w:val="19"/>
-        </w:rPr>
-        <w:t>Ministry: Ministry of Finance  |  Keywords: Economic Governance &amp; Fiscal Policy</w:t>
-        <w:br/>
-      </w:r>
-      <w:r>
-        <w:rPr>
-          <w:b/>
-          <w:color w:val="1E40AF"/>
-          <w:sz w:val="20"/>
-        </w:rPr>
-        <w:t>UPSC Alignment: Strategic policy update from nodal ministry (Ministry of Finance): Economic Governance &amp; Fiscal Policy</w:t>
-        <w:br/>
-      </w:r>
-      <w:r>
-        <w:rPr>
-          <w:b/>
-          <w:color w:val="475569"/>
-          <w:sz w:val="18"/>
-        </w:rPr>
-        <w:t xml:space="preserve">Official PIB Link: </w:t>
-      </w:r>
-      <w:hyperlink r:id="rId29">
-        <w:r>
-          <w:rPr>
-            <w:color w:val="0284C7"/>
-            <w:u w:val="single"/>
-            <w:sz w:val="18"/>
-          </w:rPr>
-          <w:t>https://www.pib.gov.in/PressReleaseDetail.aspx?PRID=2319696</w:t>
-        </w:r>
-      </w:hyperlink>
-      <w:r>
-        <w:br/>
-      </w:r>
-    </w:p>
-    <w:p>
-      <w:pPr>
-        <w:spacing w:before="80" w:after="40"/>
-        <w:ind w:left="288"/>
-      </w:pPr>
-      <w:r>
-        <w:rPr>
-          <w:b/>
-        </w:rPr>
-        <w:t xml:space="preserve">11. </w:t>
-      </w:r>
-      <w:r>
-        <w:rPr>
-          <w:rFonts w:ascii="Calibri" w:hAnsi="Calibri"/>
-          <w:b/>
-          <w:sz w:val="23"/>
-        </w:rPr>
-        <w:t>Chintan Shivir 2026 Concludes with Focus on Collaborative Knowledge Sharing for Quality Road Infrastructure</w:t>
-        <w:br/>
-      </w:r>
-    </w:p>
-    <w:p>
-      <w:pPr>
-        <w:spacing w:after="40"/>
-        <w:ind w:left="576"/>
-      </w:pPr>
-      <w:r>
-        <w:rPr>
-          <w:i/>
-          <w:color w:val="64748B"/>
-          <w:sz w:val="19"/>
-        </w:rPr>
-        <w:t>Ministry: Ministry of Road Transport &amp; Highways  |  Keywords: infrastructure</w:t>
-        <w:br/>
-      </w:r>
-      <w:r>
-        <w:rPr>
-          <w:b/>
-          <w:color w:val="1E40AF"/>
-          <w:sz w:val="20"/>
-        </w:rPr>
-        <w:t>UPSC Alignment: Aligned with General Studies 3 topics: infrastructure</w:t>
-        <w:br/>
-      </w:r>
-      <w:r>
-        <w:rPr>
-          <w:b/>
-          <w:color w:val="475569"/>
-          <w:sz w:val="18"/>
-        </w:rPr>
-        <w:t xml:space="preserve">Official PIB Link: </w:t>
-      </w:r>
-      <w:hyperlink r:id="rId30">
-        <w:r>
-          <w:rPr>
-            <w:color w:val="0284C7"/>
-            <w:u w:val="single"/>
-            <w:sz w:val="18"/>
-          </w:rPr>
-          <w:t>https://www.pib.gov.in/PressReleaseDetail.aspx?PRID=2319749</w:t>
-        </w:r>
-      </w:hyperlink>
-      <w:r>
-        <w:br/>
-      </w:r>
-    </w:p>
-    <w:p>
-      <w:pPr>
-        <w:spacing w:before="80" w:after="40"/>
-        <w:ind w:left="288"/>
-      </w:pPr>
-      <w:r>
-        <w:rPr>
-          <w:b/>
-        </w:rPr>
-        <w:t xml:space="preserve">12. </w:t>
+        <w:t xml:space="preserve">7. </w:t>
       </w:r>
       <w:r>
         <w:rPr>
@@ -1610,7 +752,7 @@
         </w:rPr>
         <w:t xml:space="preserve">Official PIB Link: </w:t>
       </w:r>
-      <w:hyperlink r:id="rId31">
+      <w:hyperlink r:id="rId18">
         <w:r>
           <w:rPr>
             <w:color w:val="0284C7"/>

</xml_diff>